<commit_message>
1. Upload BO TS session
</commit_message>
<xml_diff>
--- a/Prerequisites/Instructions_Setup.docx
+++ b/Prerequisites/Instructions_Setup.docx
@@ -20,16 +20,8 @@
         <w:rPr>
           <w:lang w:val="en-US"/>
         </w:rPr>
-        <w:t xml:space="preserve">Installing </w:t>
-      </w:r>
-      <w:proofErr w:type="spellStart"/>
-      <w:r>
-        <w:rPr>
-          <w:lang w:val="en-US"/>
-        </w:rPr>
-        <w:t>Miniconda</w:t>
-      </w:r>
-      <w:proofErr w:type="spellEnd"/>
+        <w:t>Installing Miniconda</w:t>
+      </w:r>
     </w:p>
     <w:p>
       <w:pPr>
@@ -233,14 +225,12 @@
           <w:lang w:val="en-US" w:eastAsia="es-ES"/>
         </w:rPr>
       </w:pPr>
-      <w:proofErr w:type="spellStart"/>
       <w:r>
         <w:rPr>
           <w:lang w:val="en-US" w:eastAsia="es-ES"/>
         </w:rPr>
         <w:t>MacOs</w:t>
       </w:r>
-      <w:proofErr w:type="spellEnd"/>
     </w:p>
     <w:p>
       <w:pPr>
@@ -611,16 +601,8 @@
         <w:rPr>
           <w:lang w:val="en-US"/>
         </w:rPr>
-        <w:t xml:space="preserve">wnload and Install </w:t>
-      </w:r>
-      <w:proofErr w:type="spellStart"/>
-      <w:r>
-        <w:rPr>
-          <w:lang w:val="en-US"/>
-        </w:rPr>
-        <w:t>Miniconda</w:t>
-      </w:r>
-      <w:proofErr w:type="spellEnd"/>
+        <w:t>wnload and Install Miniconda</w:t>
+      </w:r>
       <w:r>
         <w:rPr>
           <w:lang w:val="en-US"/>
@@ -652,21 +634,7 @@
         <w:rPr>
           <w:lang w:val="en-US"/>
         </w:rPr>
-        <w:t>” and select your OS in the “</w:t>
-      </w:r>
-      <w:proofErr w:type="spellStart"/>
-      <w:r>
-        <w:rPr>
-          <w:lang w:val="en-US"/>
-        </w:rPr>
-        <w:t>Quickstart</w:t>
-      </w:r>
-      <w:proofErr w:type="spellEnd"/>
-      <w:r>
-        <w:rPr>
-          <w:lang w:val="en-US"/>
-        </w:rPr>
-        <w:t xml:space="preserve"> install instructions” tab:</w:t>
+        <w:t>” and select your OS in the “Quickstart install instructions” tab:</w:t>
       </w:r>
     </w:p>
     <w:p>
@@ -867,31 +835,7 @@
           <w:lang w:val="en-US" w:eastAsia="es-ES"/>
           <w14:ligatures w14:val="none"/>
         </w:rPr>
-        <w:t xml:space="preserve">During the </w:t>
-      </w:r>
-      <w:proofErr w:type="spellStart"/>
-      <w:r>
-        <w:rPr>
-          <w:rFonts w:eastAsia="Times New Roman" w:cs="Courier New"/>
-          <w:kern w:val="0"/>
-          <w:sz w:val="24"/>
-          <w:szCs w:val="24"/>
-          <w:lang w:val="en-US" w:eastAsia="es-ES"/>
-          <w14:ligatures w14:val="none"/>
-        </w:rPr>
-        <w:t>Miniconda</w:t>
-      </w:r>
-      <w:proofErr w:type="spellEnd"/>
-      <w:r>
-        <w:rPr>
-          <w:rFonts w:eastAsia="Times New Roman" w:cs="Courier New"/>
-          <w:kern w:val="0"/>
-          <w:sz w:val="24"/>
-          <w:szCs w:val="24"/>
-          <w:lang w:val="en-US" w:eastAsia="es-ES"/>
-          <w14:ligatures w14:val="none"/>
-        </w:rPr>
-        <w:t xml:space="preserve"> installation, i</w:t>
+        <w:t>During the Miniconda installation, i</w:t>
       </w:r>
       <w:r>
         <w:rPr>
@@ -930,31 +874,7 @@
           <w:lang w:val="en-US" w:eastAsia="es-ES"/>
           <w14:ligatures w14:val="none"/>
         </w:rPr>
-        <w:t>Invoke-</w:t>
-      </w:r>
-      <w:proofErr w:type="spellStart"/>
-      <w:r>
-        <w:rPr>
-          <w:rFonts w:eastAsia="Times New Roman" w:cs="Courier New"/>
-          <w:kern w:val="0"/>
-          <w:sz w:val="24"/>
-          <w:szCs w:val="24"/>
-          <w:lang w:val="en-US" w:eastAsia="es-ES"/>
-          <w14:ligatures w14:val="none"/>
-        </w:rPr>
-        <w:t>WebRequest</w:t>
-      </w:r>
-      <w:proofErr w:type="spellEnd"/>
-      <w:r>
-        <w:rPr>
-          <w:rFonts w:eastAsia="Times New Roman" w:cs="Courier New"/>
-          <w:kern w:val="0"/>
-          <w:sz w:val="24"/>
-          <w:szCs w:val="24"/>
-          <w:lang w:val="en-US" w:eastAsia="es-ES"/>
-          <w14:ligatures w14:val="none"/>
-        </w:rPr>
-        <w:t xml:space="preserve"> : Access to the path 'C:\windows\system32\Miniconda3-latest-Windows-x86_64.exe' is denied.</w:t>
+        <w:t>Invoke-WebRequest : Access to the path 'C:\windows\system32\Miniconda3-latest-Windows-x86_64.exe' is denied.</w:t>
       </w:r>
     </w:p>
     <w:p>
@@ -1010,79 +930,7 @@
           <w:lang w:val="en-US" w:eastAsia="es-ES"/>
           <w14:ligatures w14:val="none"/>
         </w:rPr>
-        <w:t>+ Invoke-</w:t>
-      </w:r>
-      <w:proofErr w:type="spellStart"/>
-      <w:r>
-        <w:rPr>
-          <w:rFonts w:eastAsia="Times New Roman" w:cs="Courier New"/>
-          <w:kern w:val="0"/>
-          <w:sz w:val="24"/>
-          <w:szCs w:val="24"/>
-          <w:lang w:val="en-US" w:eastAsia="es-ES"/>
-          <w14:ligatures w14:val="none"/>
-        </w:rPr>
-        <w:t>WebRequest</w:t>
-      </w:r>
-      <w:proofErr w:type="spellEnd"/>
-      <w:r>
-        <w:rPr>
-          <w:rFonts w:eastAsia="Times New Roman" w:cs="Courier New"/>
-          <w:kern w:val="0"/>
-          <w:sz w:val="24"/>
-          <w:szCs w:val="24"/>
-          <w:lang w:val="en-US" w:eastAsia="es-ES"/>
-          <w14:ligatures w14:val="none"/>
-        </w:rPr>
-        <w:t xml:space="preserve"> -Uri "https://repo.anaconda.com/</w:t>
-      </w:r>
-      <w:proofErr w:type="spellStart"/>
-      <w:r>
-        <w:rPr>
-          <w:rFonts w:eastAsia="Times New Roman" w:cs="Courier New"/>
-          <w:kern w:val="0"/>
-          <w:sz w:val="24"/>
-          <w:szCs w:val="24"/>
-          <w:lang w:val="en-US" w:eastAsia="es-ES"/>
-          <w14:ligatures w14:val="none"/>
-        </w:rPr>
-        <w:t>miniconda</w:t>
-      </w:r>
-      <w:proofErr w:type="spellEnd"/>
-      <w:r>
-        <w:rPr>
-          <w:rFonts w:eastAsia="Times New Roman" w:cs="Courier New"/>
-          <w:kern w:val="0"/>
-          <w:sz w:val="24"/>
-          <w:szCs w:val="24"/>
-          <w:lang w:val="en-US" w:eastAsia="es-ES"/>
-          <w14:ligatures w14:val="none"/>
-        </w:rPr>
-        <w:t>/</w:t>
-      </w:r>
-      <w:proofErr w:type="spellStart"/>
-      <w:r>
-        <w:rPr>
-          <w:rFonts w:eastAsia="Times New Roman" w:cs="Courier New"/>
-          <w:kern w:val="0"/>
-          <w:sz w:val="24"/>
-          <w:szCs w:val="24"/>
-          <w:lang w:val="en-US" w:eastAsia="es-ES"/>
-          <w14:ligatures w14:val="none"/>
-        </w:rPr>
-        <w:t>Miniconda</w:t>
-      </w:r>
-      <w:proofErr w:type="spellEnd"/>
-      <w:r>
-        <w:rPr>
-          <w:rFonts w:eastAsia="Times New Roman" w:cs="Courier New"/>
-          <w:kern w:val="0"/>
-          <w:sz w:val="24"/>
-          <w:szCs w:val="24"/>
-          <w:lang w:val="en-US" w:eastAsia="es-ES"/>
-          <w14:ligatures w14:val="none"/>
-        </w:rPr>
-        <w:t xml:space="preserve"> ...</w:t>
+        <w:t>+ Invoke-WebRequest -Uri "https://repo.anaconda.com/miniconda/Miniconda ...</w:t>
       </w:r>
     </w:p>
     <w:p>
@@ -1138,69 +986,8 @@
           <w:lang w:val="en-US" w:eastAsia="es-ES"/>
           <w14:ligatures w14:val="none"/>
         </w:rPr>
-        <w:t xml:space="preserve">    + CategoryInfo          : </w:t>
-      </w:r>
-      <w:proofErr w:type="spellStart"/>
-      <w:r>
-        <w:rPr>
-          <w:rFonts w:eastAsia="Times New Roman" w:cs="Courier New"/>
-          <w:kern w:val="0"/>
-          <w:sz w:val="24"/>
-          <w:szCs w:val="24"/>
-          <w:lang w:val="en-US" w:eastAsia="es-ES"/>
-          <w14:ligatures w14:val="none"/>
-        </w:rPr>
-        <w:t>NotSpecified</w:t>
-      </w:r>
-      <w:proofErr w:type="spellEnd"/>
-      <w:r>
-        <w:rPr>
-          <w:rFonts w:eastAsia="Times New Roman" w:cs="Courier New"/>
-          <w:kern w:val="0"/>
-          <w:sz w:val="24"/>
-          <w:szCs w:val="24"/>
-          <w:lang w:val="en-US" w:eastAsia="es-ES"/>
-          <w14:ligatures w14:val="none"/>
-        </w:rPr>
-        <w:t>: (:) [Invoke-</w:t>
-      </w:r>
-      <w:proofErr w:type="spellStart"/>
-      <w:r>
-        <w:rPr>
-          <w:rFonts w:eastAsia="Times New Roman" w:cs="Courier New"/>
-          <w:kern w:val="0"/>
-          <w:sz w:val="24"/>
-          <w:szCs w:val="24"/>
-          <w:lang w:val="en-US" w:eastAsia="es-ES"/>
-          <w14:ligatures w14:val="none"/>
-        </w:rPr>
-        <w:t>WebRequest</w:t>
-      </w:r>
-      <w:proofErr w:type="spellEnd"/>
-      <w:r>
-        <w:rPr>
-          <w:rFonts w:eastAsia="Times New Roman" w:cs="Courier New"/>
-          <w:kern w:val="0"/>
-          <w:sz w:val="24"/>
-          <w:szCs w:val="24"/>
-          <w:lang w:val="en-US" w:eastAsia="es-ES"/>
-          <w14:ligatures w14:val="none"/>
-        </w:rPr>
-        <w:t xml:space="preserve">], </w:t>
-      </w:r>
-      <w:proofErr w:type="spellStart"/>
-      <w:r>
-        <w:rPr>
-          <w:rFonts w:eastAsia="Times New Roman" w:cs="Courier New"/>
-          <w:kern w:val="0"/>
-          <w:sz w:val="24"/>
-          <w:szCs w:val="24"/>
-          <w:lang w:val="en-US" w:eastAsia="es-ES"/>
-          <w14:ligatures w14:val="none"/>
-        </w:rPr>
-        <w:t>UnauthorizedAccessException</w:t>
-      </w:r>
-      <w:proofErr w:type="spellEnd"/>
+        <w:t xml:space="preserve">    + CategoryInfo          : NotSpecified: (:) [Invoke-WebRequest], UnauthorizedAccessException</w:t>
+      </w:r>
     </w:p>
     <w:p>
       <w:pPr>
@@ -1229,31 +1016,7 @@
           <w14:ligatures w14:val="none"/>
         </w:rPr>
         <w:lastRenderedPageBreak/>
-        <w:t xml:space="preserve">    + </w:t>
-      </w:r>
-      <w:proofErr w:type="spellStart"/>
-      <w:r>
-        <w:rPr>
-          <w:rFonts w:eastAsia="Times New Roman" w:cs="Courier New"/>
-          <w:kern w:val="0"/>
-          <w:sz w:val="24"/>
-          <w:szCs w:val="24"/>
-          <w:lang w:val="en-US" w:eastAsia="es-ES"/>
-          <w14:ligatures w14:val="none"/>
-        </w:rPr>
-        <w:t>FullyQualifiedErrorId</w:t>
-      </w:r>
-      <w:proofErr w:type="spellEnd"/>
-      <w:r>
-        <w:rPr>
-          <w:rFonts w:eastAsia="Times New Roman" w:cs="Courier New"/>
-          <w:kern w:val="0"/>
-          <w:sz w:val="24"/>
-          <w:szCs w:val="24"/>
-          <w:lang w:val="en-US" w:eastAsia="es-ES"/>
-          <w14:ligatures w14:val="none"/>
-        </w:rPr>
-        <w:t xml:space="preserve"> : System.UnauthorizedAccessException,Microsoft.PowerShell.Commands.InvokeWebRequestCommand</w:t>
+        <w:t xml:space="preserve">    + FullyQualifiedErrorId : System.UnauthorizedAccessException,Microsoft.PowerShell.Commands.InvokeWebRequestCommand</w:t>
       </w:r>
     </w:p>
     <w:p>
@@ -1335,31 +1098,7 @@
           <w:lang w:val="en-US" w:eastAsia="es-ES"/>
           <w14:ligatures w14:val="none"/>
         </w:rPr>
-        <w:t xml:space="preserve">and then try again with the commands suggested in the </w:t>
-      </w:r>
-      <w:proofErr w:type="spellStart"/>
-      <w:r>
-        <w:rPr>
-          <w:rFonts w:eastAsia="Times New Roman" w:cs="Courier New"/>
-          <w:kern w:val="0"/>
-          <w:sz w:val="24"/>
-          <w:szCs w:val="24"/>
-          <w:lang w:val="en-US" w:eastAsia="es-ES"/>
-          <w14:ligatures w14:val="none"/>
-        </w:rPr>
-        <w:t>miniconda</w:t>
-      </w:r>
-      <w:proofErr w:type="spellEnd"/>
-      <w:r>
-        <w:rPr>
-          <w:rFonts w:eastAsia="Times New Roman" w:cs="Courier New"/>
-          <w:kern w:val="0"/>
-          <w:sz w:val="24"/>
-          <w:szCs w:val="24"/>
-          <w:lang w:val="en-US" w:eastAsia="es-ES"/>
-          <w14:ligatures w14:val="none"/>
-        </w:rPr>
-        <w:t xml:space="preserve"> webpage</w:t>
+        <w:t>and then try again with the commands suggested in the miniconda webpage</w:t>
       </w:r>
       <w:r>
         <w:rPr>
@@ -1627,7 +1366,6 @@
           <w:lang w:val="en-US"/>
         </w:rPr>
       </w:pPr>
-      <w:proofErr w:type="spellStart"/>
       <w:r>
         <w:rPr>
           <w:b/>
@@ -1636,7 +1374,6 @@
         </w:rPr>
         <w:t>Jupyter</w:t>
       </w:r>
-      <w:proofErr w:type="spellEnd"/>
     </w:p>
     <w:p>
       <w:pPr>
@@ -2344,21 +2081,7 @@
         <w:rPr>
           <w:lang w:val="en-US"/>
         </w:rPr>
-        <w:t xml:space="preserve">.1.A. Windows: after installing </w:t>
-      </w:r>
-      <w:proofErr w:type="spellStart"/>
-      <w:r>
-        <w:rPr>
-          <w:lang w:val="en-US"/>
-        </w:rPr>
-        <w:t>Miniconda</w:t>
-      </w:r>
-      <w:proofErr w:type="spellEnd"/>
-      <w:r>
-        <w:rPr>
-          <w:lang w:val="en-US"/>
-        </w:rPr>
-        <w:t xml:space="preserve"> (Step 1.2), you can now open an “Anaconda prompt”. Look for this tool in your applications an</w:t>
+        <w:t>.1.A. Windows: after installing Miniconda (Step 1.2), you can now open an “Anaconda prompt”. Look for this tool in your applications an</w:t>
       </w:r>
       <w:r>
         <w:rPr>
@@ -2469,35 +2192,7 @@
         <w:rPr>
           <w:lang w:val="en-US"/>
         </w:rPr>
-        <w:t xml:space="preserve">.2. Create New Conda Environments (named </w:t>
-      </w:r>
-      <w:proofErr w:type="spellStart"/>
-      <w:r>
-        <w:rPr>
-          <w:lang w:val="en-US"/>
-        </w:rPr>
-        <w:t>cheminf</w:t>
-      </w:r>
-      <w:proofErr w:type="spellEnd"/>
-      <w:r>
-        <w:rPr>
-          <w:lang w:val="en-US"/>
-        </w:rPr>
-        <w:t xml:space="preserve"> &amp; </w:t>
-      </w:r>
-      <w:proofErr w:type="spellStart"/>
-      <w:r>
-        <w:rPr>
-          <w:lang w:val="en-US"/>
-        </w:rPr>
-        <w:t>almos</w:t>
-      </w:r>
-      <w:proofErr w:type="spellEnd"/>
-      <w:r>
-        <w:rPr>
-          <w:lang w:val="en-US"/>
-        </w:rPr>
-        <w:t>)</w:t>
+        <w:t>.2. Create New Conda Environments (named cheminf &amp; almos)</w:t>
       </w:r>
     </w:p>
     <w:p>
@@ -2550,14 +2245,12 @@
         </w:rPr>
         <w:t>/</w:t>
       </w:r>
-      <w:proofErr w:type="spellStart"/>
       <w:r>
         <w:rPr>
           <w:lang w:val="en-US"/>
         </w:rPr>
         <w:t>Setup_and_testing</w:t>
       </w:r>
-      <w:proofErr w:type="spellEnd"/>
       <w:r>
         <w:rPr>
           <w:lang w:val="en-US"/>
@@ -2606,14 +2299,12 @@
         </w:rPr>
         <w:t>/</w:t>
       </w:r>
-      <w:proofErr w:type="spellStart"/>
       <w:r>
         <w:rPr>
           <w:lang w:val="en-US"/>
         </w:rPr>
         <w:t>Setup_and_testing</w:t>
       </w:r>
-      <w:proofErr w:type="spellEnd"/>
       <w:r>
         <w:rPr>
           <w:lang w:val="en-US"/>
@@ -2807,25 +2498,7 @@
           <w:szCs w:val="24"/>
           <w:lang w:val="en-US"/>
         </w:rPr>
-        <w:t>terminal should be in the “</w:t>
-      </w:r>
-      <w:proofErr w:type="spellStart"/>
-      <w:r>
-        <w:rPr>
-          <w:sz w:val="24"/>
-          <w:szCs w:val="24"/>
-          <w:lang w:val="en-US"/>
-        </w:rPr>
-        <w:t>Setup_and_testing</w:t>
-      </w:r>
-      <w:proofErr w:type="spellEnd"/>
-      <w:r>
-        <w:rPr>
-          <w:sz w:val="24"/>
-          <w:szCs w:val="24"/>
-          <w:lang w:val="en-US"/>
-        </w:rPr>
-        <w:t>” folder. Y</w:t>
+        <w:t>terminal should be in the “Setup_and_testing” folder. Y</w:t>
       </w:r>
       <w:r>
         <w:rPr>
@@ -2980,61 +2653,7 @@
           <w:szCs w:val="24"/>
           <w:lang w:val="en-US"/>
         </w:rPr>
-        <w:t xml:space="preserve">Make sure that you don’t have any previous environments with the same names as those to install (i.e., </w:t>
-      </w:r>
-      <w:proofErr w:type="spellStart"/>
-      <w:r>
-        <w:rPr>
-          <w:sz w:val="24"/>
-          <w:szCs w:val="24"/>
-          <w:lang w:val="en-US"/>
-        </w:rPr>
-        <w:t>cheminf</w:t>
-      </w:r>
-      <w:proofErr w:type="spellEnd"/>
-      <w:r>
-        <w:rPr>
-          <w:sz w:val="24"/>
-          <w:szCs w:val="24"/>
-          <w:lang w:val="en-US"/>
-        </w:rPr>
-        <w:t xml:space="preserve">, </w:t>
-      </w:r>
-      <w:proofErr w:type="spellStart"/>
-      <w:r>
-        <w:rPr>
-          <w:sz w:val="24"/>
-          <w:szCs w:val="24"/>
-          <w:lang w:val="en-US"/>
-        </w:rPr>
-        <w:t>baybe</w:t>
-      </w:r>
-      <w:proofErr w:type="spellEnd"/>
-      <w:r>
-        <w:rPr>
-          <w:sz w:val="24"/>
-          <w:szCs w:val="24"/>
-          <w:lang w:val="en-US"/>
-        </w:rPr>
-        <w:t xml:space="preserve">, </w:t>
-      </w:r>
-      <w:proofErr w:type="spellStart"/>
-      <w:r>
-        <w:rPr>
-          <w:sz w:val="24"/>
-          <w:szCs w:val="24"/>
-          <w:lang w:val="en-US"/>
-        </w:rPr>
-        <w:t>chemtorch</w:t>
-      </w:r>
-      <w:proofErr w:type="spellEnd"/>
-      <w:r>
-        <w:rPr>
-          <w:sz w:val="24"/>
-          <w:szCs w:val="24"/>
-          <w:lang w:val="en-US"/>
-        </w:rPr>
-        <w:t>, etc.). For this, execute:</w:t>
+        <w:t>Make sure that you don’t have any previous environments with the same names as those to install (i.e., cheminf, baybe, chemtorch, etc.). For this, execute:</w:t>
       </w:r>
     </w:p>
     <w:p>
@@ -3047,23 +2666,13 @@
           <w:lang w:val="en-US"/>
         </w:rPr>
       </w:pPr>
-      <w:proofErr w:type="spellStart"/>
-      <w:r>
-        <w:rPr>
-          <w:sz w:val="24"/>
-          <w:szCs w:val="24"/>
-          <w:lang w:val="en-US"/>
-        </w:rPr>
-        <w:t>conda</w:t>
-      </w:r>
-      <w:proofErr w:type="spellEnd"/>
-      <w:r>
-        <w:rPr>
-          <w:sz w:val="24"/>
-          <w:szCs w:val="24"/>
-          <w:lang w:val="en-US"/>
-        </w:rPr>
-        <w:t xml:space="preserve"> env list</w:t>
+      <w:r>
+        <w:rPr>
+          <w:sz w:val="24"/>
+          <w:szCs w:val="24"/>
+          <w:lang w:val="en-US"/>
+        </w:rPr>
+        <w:t>conda env list</w:t>
       </w:r>
     </w:p>
     <w:p>
@@ -3178,50 +2787,48 @@
           <w:lang w:val="en-GB"/>
         </w:rPr>
       </w:pPr>
-      <w:proofErr w:type="spellStart"/>
       <w:r>
         <w:rPr>
           <w:sz w:val="24"/>
           <w:szCs w:val="24"/>
           <w:lang w:val="en-GB"/>
         </w:rPr>
-        <w:t>conda</w:t>
-      </w:r>
-      <w:proofErr w:type="spellEnd"/>
-      <w:r>
-        <w:rPr>
+        <w:t xml:space="preserve">conda env remove -y -n </w:t>
+      </w:r>
+      <w:r>
+        <w:rPr>
+          <w:color w:val="C00000"/>
           <w:sz w:val="24"/>
           <w:szCs w:val="24"/>
           <w:lang w:val="en-GB"/>
         </w:rPr>
-        <w:t xml:space="preserve"> env remove -y -n </w:t>
-      </w:r>
-      <w:r>
-        <w:rPr>
-          <w:color w:val="C00000"/>
+        <w:t>ENVIRONMENT</w:t>
+      </w:r>
+    </w:p>
+    <w:p>
+      <w:pPr>
+        <w:jc w:val="both"/>
+        <w:rPr>
           <w:sz w:val="24"/>
           <w:szCs w:val="24"/>
           <w:lang w:val="en-GB"/>
         </w:rPr>
-        <w:t>ENVIRONMENT</w:t>
-      </w:r>
-    </w:p>
-    <w:p>
-      <w:pPr>
-        <w:jc w:val="both"/>
+      </w:pPr>
+      <w:r>
         <w:rPr>
           <w:sz w:val="24"/>
           <w:szCs w:val="24"/>
           <w:lang w:val="en-GB"/>
         </w:rPr>
-      </w:pPr>
+        <w:t>**</w:t>
+      </w:r>
       <w:r>
         <w:rPr>
           <w:sz w:val="24"/>
           <w:szCs w:val="24"/>
           <w:lang w:val="en-GB"/>
         </w:rPr>
-        <w:t>**</w:t>
+        <w:t>B</w:t>
       </w:r>
       <w:r>
         <w:rPr>
@@ -3229,7 +2836,7 @@
           <w:szCs w:val="24"/>
           <w:lang w:val="en-GB"/>
         </w:rPr>
-        <w:t>B</w:t>
+        <w:t>ut first, replace ENVIRONMENT f</w:t>
       </w:r>
       <w:r>
         <w:rPr>
@@ -3237,33 +2844,7 @@
           <w:szCs w:val="24"/>
           <w:lang w:val="en-GB"/>
         </w:rPr>
-        <w:t>ut first, replace ENVIRONMENT f</w:t>
-      </w:r>
-      <w:r>
-        <w:rPr>
-          <w:sz w:val="24"/>
-          <w:szCs w:val="24"/>
-          <w:lang w:val="en-GB"/>
-        </w:rPr>
-        <w:t xml:space="preserve">or the name of the environment to remove, for example, the following command removes the </w:t>
-      </w:r>
-      <w:proofErr w:type="spellStart"/>
-      <w:r>
-        <w:rPr>
-          <w:sz w:val="24"/>
-          <w:szCs w:val="24"/>
-          <w:lang w:val="en-GB"/>
-        </w:rPr>
-        <w:t>cheminf</w:t>
-      </w:r>
-      <w:proofErr w:type="spellEnd"/>
-      <w:r>
-        <w:rPr>
-          <w:sz w:val="24"/>
-          <w:szCs w:val="24"/>
-          <w:lang w:val="en-GB"/>
-        </w:rPr>
-        <w:t xml:space="preserve"> environment:</w:t>
+        <w:t>or the name of the environment to remove, for example, the following command removes the cheminf environment:</w:t>
       </w:r>
     </w:p>
     <w:p>
@@ -3276,77 +2857,21 @@
           <w:lang w:val="es-ES"/>
         </w:rPr>
       </w:pPr>
-      <w:proofErr w:type="spellStart"/>
       <w:r>
         <w:rPr>
           <w:sz w:val="24"/>
           <w:szCs w:val="24"/>
           <w:lang w:val="es-ES"/>
         </w:rPr>
-        <w:t>conda</w:t>
-      </w:r>
-      <w:proofErr w:type="spellEnd"/>
-      <w:r>
-        <w:rPr>
-          <w:sz w:val="24"/>
-          <w:szCs w:val="24"/>
+        <w:t>conda env remove -y -n cheminf</w:t>
+      </w:r>
+    </w:p>
+    <w:p>
+      <w:pPr>
+        <w:jc w:val="both"/>
+        <w:rPr>
           <w:lang w:val="es-ES"/>
         </w:rPr>
-        <w:t xml:space="preserve"> </w:t>
-      </w:r>
-      <w:proofErr w:type="spellStart"/>
-      <w:r>
-        <w:rPr>
-          <w:sz w:val="24"/>
-          <w:szCs w:val="24"/>
-          <w:lang w:val="es-ES"/>
-        </w:rPr>
-        <w:t>env</w:t>
-      </w:r>
-      <w:proofErr w:type="spellEnd"/>
-      <w:r>
-        <w:rPr>
-          <w:sz w:val="24"/>
-          <w:szCs w:val="24"/>
-          <w:lang w:val="es-ES"/>
-        </w:rPr>
-        <w:t xml:space="preserve"> </w:t>
-      </w:r>
-      <w:proofErr w:type="spellStart"/>
-      <w:r>
-        <w:rPr>
-          <w:sz w:val="24"/>
-          <w:szCs w:val="24"/>
-          <w:lang w:val="es-ES"/>
-        </w:rPr>
-        <w:t>remove</w:t>
-      </w:r>
-      <w:proofErr w:type="spellEnd"/>
-      <w:r>
-        <w:rPr>
-          <w:sz w:val="24"/>
-          <w:szCs w:val="24"/>
-          <w:lang w:val="es-ES"/>
-        </w:rPr>
-        <w:t xml:space="preserve"> -y -n </w:t>
-      </w:r>
-      <w:proofErr w:type="spellStart"/>
-      <w:r>
-        <w:rPr>
-          <w:sz w:val="24"/>
-          <w:szCs w:val="24"/>
-          <w:lang w:val="es-ES"/>
-        </w:rPr>
-        <w:t>cheminf</w:t>
-      </w:r>
-      <w:proofErr w:type="spellEnd"/>
-    </w:p>
-    <w:p>
-      <w:pPr>
-        <w:jc w:val="both"/>
-        <w:rPr>
-          <w:lang w:val="es-ES"/>
-        </w:rPr>
       </w:pPr>
     </w:p>
     <w:p>
@@ -3391,7 +2916,19 @@
         <w:rPr>
           <w:lang w:val="en-US"/>
         </w:rPr>
-        <w:t xml:space="preserve"> the two following commands separately. Note some installations may take a few minutes.</w:t>
+        <w:t xml:space="preserve"> the </w:t>
+      </w:r>
+      <w:r>
+        <w:rPr>
+          <w:lang w:val="en-US"/>
+        </w:rPr>
+        <w:t>three</w:t>
+      </w:r>
+      <w:r>
+        <w:rPr>
+          <w:lang w:val="en-US"/>
+        </w:rPr>
+        <w:t xml:space="preserve"> following commands separately. Note some installations may take a few minutes.</w:t>
       </w:r>
     </w:p>
     <w:p>
@@ -3402,28 +2939,12 @@
           <w:lang w:val="en-US"/>
         </w:rPr>
       </w:pPr>
-      <w:proofErr w:type="spellStart"/>
-      <w:r>
-        <w:rPr>
-          <w:lang w:val="en-US"/>
-        </w:rPr>
-        <w:t>conda</w:t>
-      </w:r>
-      <w:proofErr w:type="spellEnd"/>
-      <w:r>
-        <w:rPr>
-          <w:lang w:val="en-US"/>
-        </w:rPr>
-        <w:t xml:space="preserve"> env create -f </w:t>
-      </w:r>
-      <w:proofErr w:type="spellStart"/>
-      <w:r>
-        <w:rPr>
-          <w:lang w:val="en-US"/>
-        </w:rPr>
-        <w:t>cheminf.yaml</w:t>
-      </w:r>
-      <w:proofErr w:type="spellEnd"/>
+      <w:r>
+        <w:rPr>
+          <w:lang w:val="en-US"/>
+        </w:rPr>
+        <w:t>conda env create -f cheminf.yaml</w:t>
+      </w:r>
     </w:p>
     <w:p>
       <w:pPr>
@@ -3433,28 +2954,33 @@
           <w:lang w:val="en-US"/>
         </w:rPr>
       </w:pPr>
-      <w:proofErr w:type="spellStart"/>
-      <w:r>
-        <w:rPr>
-          <w:lang w:val="en-US"/>
-        </w:rPr>
-        <w:t>conda</w:t>
-      </w:r>
-      <w:proofErr w:type="spellEnd"/>
-      <w:r>
-        <w:rPr>
-          <w:lang w:val="en-US"/>
-        </w:rPr>
-        <w:t xml:space="preserve"> env create -f </w:t>
-      </w:r>
-      <w:proofErr w:type="spellStart"/>
-      <w:r>
-        <w:rPr>
-          <w:lang w:val="en-US"/>
-        </w:rPr>
-        <w:t>almos.yaml</w:t>
-      </w:r>
-      <w:proofErr w:type="spellEnd"/>
+      <w:r>
+        <w:rPr>
+          <w:lang w:val="en-US"/>
+        </w:rPr>
+        <w:t>conda env create -f almos.yaml</w:t>
+      </w:r>
+    </w:p>
+    <w:p>
+      <w:pPr>
+        <w:shd w:val="clear" w:color="auto" w:fill="E8E8E8" w:themeFill="background2"/>
+        <w:jc w:val="both"/>
+        <w:rPr>
+          <w:lang w:val="en-US"/>
+        </w:rPr>
+      </w:pPr>
+      <w:r>
+        <w:rPr>
+          <w:lang w:val="en-US"/>
+        </w:rPr>
+        <w:t xml:space="preserve">conda env create -f </w:t>
+      </w:r>
+      <w:r>
+        <w:rPr>
+          <w:lang w:val="en-US"/>
+        </w:rPr>
+        <w:t>environment_TS_CAMLC.yml</w:t>
+      </w:r>
     </w:p>
     <w:p>
       <w:pPr>
@@ -3513,7 +3039,6 @@
         </w:rPr>
         <w:t xml:space="preserve">5.1. </w:t>
       </w:r>
-      <w:proofErr w:type="spellStart"/>
       <w:r>
         <w:rPr>
           <w:u w:val="single"/>
@@ -3526,15 +3051,7 @@
           <w:u w:val="single"/>
           <w:lang w:val="en-US"/>
         </w:rPr>
-        <w:t>heminf</w:t>
-      </w:r>
-      <w:proofErr w:type="spellEnd"/>
-      <w:r>
-        <w:rPr>
-          <w:u w:val="single"/>
-          <w:lang w:val="en-US"/>
-        </w:rPr>
-        <w:t xml:space="preserve"> environment</w:t>
+        <w:t>heminf environment</w:t>
       </w:r>
     </w:p>
     <w:p>
@@ -3582,7 +3099,6 @@
         </w:rPr>
         <w:t>“</w:t>
       </w:r>
-      <w:proofErr w:type="spellStart"/>
       <w:r>
         <w:rPr>
           <w:lang w:val="en-US"/>
@@ -3593,28 +3109,13 @@
         <w:rPr>
           <w:lang w:val="en-US"/>
         </w:rPr>
-        <w:t>course_setup.ipynb</w:t>
-      </w:r>
-      <w:proofErr w:type="spellEnd"/>
-      <w:r>
-        <w:rPr>
-          <w:lang w:val="en-US"/>
-        </w:rPr>
-        <w:t xml:space="preserve">” </w:t>
-      </w:r>
-      <w:proofErr w:type="spellStart"/>
-      <w:r>
-        <w:rPr>
-          <w:lang w:val="en-US"/>
-        </w:rPr>
-        <w:t>Jupyter</w:t>
-      </w:r>
-      <w:proofErr w:type="spellEnd"/>
-      <w:r>
-        <w:rPr>
-          <w:lang w:val="en-US"/>
-        </w:rPr>
-        <w:t xml:space="preserve"> Notebook unzipped from </w:t>
+        <w:t xml:space="preserve">course_setup.ipynb” </w:t>
+      </w:r>
+      <w:r>
+        <w:rPr>
+          <w:lang w:val="en-US"/>
+        </w:rPr>
+        <w:t xml:space="preserve">Jupyter Notebook unzipped from </w:t>
       </w:r>
       <w:r>
         <w:rPr>
@@ -3642,17 +3143,8 @@
           <w:szCs w:val="24"/>
           <w:lang w:val="en-US"/>
         </w:rPr>
-        <w:t>Prerequisites/</w:t>
-      </w:r>
-      <w:proofErr w:type="spellStart"/>
-      <w:r>
-        <w:rPr>
-          <w:szCs w:val="24"/>
-          <w:lang w:val="en-US"/>
-        </w:rPr>
-        <w:t>Setup_and_testing</w:t>
-      </w:r>
-      <w:proofErr w:type="spellEnd"/>
+        <w:t>Prerequisites/Setup_and_testing</w:t>
+      </w:r>
       <w:r>
         <w:rPr>
           <w:szCs w:val="24"/>
@@ -3687,29 +3179,7 @@
           <w:szCs w:val="24"/>
           <w:lang w:val="en-US"/>
         </w:rPr>
-        <w:t>* (.</w:t>
-      </w:r>
-      <w:proofErr w:type="spellStart"/>
-      <w:r>
-        <w:rPr>
-          <w:i/>
-          <w:iCs/>
-          <w:sz w:val="24"/>
-          <w:szCs w:val="24"/>
-          <w:lang w:val="en-US"/>
-        </w:rPr>
-        <w:t>ipynb</w:t>
-      </w:r>
-      <w:proofErr w:type="spellEnd"/>
-      <w:r>
-        <w:rPr>
-          <w:i/>
-          <w:iCs/>
-          <w:sz w:val="24"/>
-          <w:szCs w:val="24"/>
-          <w:lang w:val="en-US"/>
-        </w:rPr>
-        <w:t xml:space="preserve"> means Interactive Python Notebook)</w:t>
+        <w:t>* (.ipynb means Interactive Python Notebook)</w:t>
       </w:r>
     </w:p>
     <w:p>
@@ -4005,14 +3475,12 @@
         </w:rPr>
         <w:t>“</w:t>
       </w:r>
-      <w:proofErr w:type="spellStart"/>
       <w:r>
         <w:rPr>
           <w:lang w:val="en-US"/>
         </w:rPr>
         <w:t>cheminf</w:t>
       </w:r>
-      <w:proofErr w:type="spellEnd"/>
       <w:r>
         <w:rPr>
           <w:lang w:val="en-US"/>
@@ -4050,21 +3518,7 @@
         <w:rPr>
           <w:lang w:val="en-US"/>
         </w:rPr>
-        <w:t>ake sure that you see the “</w:t>
-      </w:r>
-      <w:proofErr w:type="spellStart"/>
-      <w:r>
-        <w:rPr>
-          <w:lang w:val="en-US"/>
-        </w:rPr>
-        <w:t>cheminf</w:t>
-      </w:r>
-      <w:proofErr w:type="spellEnd"/>
-      <w:r>
-        <w:rPr>
-          <w:lang w:val="en-US"/>
-        </w:rPr>
-        <w:t xml:space="preserve">” </w:t>
+        <w:t xml:space="preserve">ake sure that you see the “cheminf” </w:t>
       </w:r>
       <w:r>
         <w:rPr>
@@ -4153,25 +3607,7 @@
           <w:szCs w:val="24"/>
           <w:lang w:val="en-US"/>
         </w:rPr>
-        <w:t xml:space="preserve">If you do not see the </w:t>
-      </w:r>
-      <w:proofErr w:type="spellStart"/>
-      <w:r>
-        <w:rPr>
-          <w:sz w:val="24"/>
-          <w:szCs w:val="24"/>
-          <w:lang w:val="en-US"/>
-        </w:rPr>
-        <w:t>Jupyter</w:t>
-      </w:r>
-      <w:proofErr w:type="spellEnd"/>
-      <w:r>
-        <w:rPr>
-          <w:sz w:val="24"/>
-          <w:szCs w:val="24"/>
-          <w:lang w:val="en-US"/>
-        </w:rPr>
-        <w:t xml:space="preserve"> kernel directly, just click on Python Environments and select the one you want to use.</w:t>
+        <w:t>If you do not see the Jupyter kernel directly, just click on Python Environments and select the one you want to use.</w:t>
       </w:r>
     </w:p>
     <w:p>
@@ -4478,43 +3914,7 @@
           <w:szCs w:val="24"/>
           <w:lang w:val="en-US"/>
         </w:rPr>
-        <w:t>the “</w:t>
-      </w:r>
-      <w:proofErr w:type="spellStart"/>
-      <w:r>
-        <w:rPr>
-          <w:sz w:val="24"/>
-          <w:szCs w:val="24"/>
-          <w:lang w:val="en-US"/>
-        </w:rPr>
-        <w:t>CHEMINF_course_setup.ipynb</w:t>
-      </w:r>
-      <w:proofErr w:type="spellEnd"/>
-      <w:r>
-        <w:rPr>
-          <w:sz w:val="24"/>
-          <w:szCs w:val="24"/>
-          <w:lang w:val="en-US"/>
-        </w:rPr>
-        <w:t xml:space="preserve">” </w:t>
-      </w:r>
-      <w:proofErr w:type="spellStart"/>
-      <w:r>
-        <w:rPr>
-          <w:sz w:val="24"/>
-          <w:szCs w:val="24"/>
-          <w:lang w:val="en-US"/>
-        </w:rPr>
-        <w:t>Jupyter</w:t>
-      </w:r>
-      <w:proofErr w:type="spellEnd"/>
-      <w:r>
-        <w:rPr>
-          <w:sz w:val="24"/>
-          <w:szCs w:val="24"/>
-          <w:lang w:val="en-US"/>
-        </w:rPr>
-        <w:t xml:space="preserve"> Notebook and, then, close </w:t>
+        <w:t xml:space="preserve">the “CHEMINF_course_setup.ipynb” Jupyter Notebook and, then, close </w:t>
       </w:r>
       <w:r>
         <w:rPr>
@@ -4551,7 +3951,6 @@
         </w:rPr>
         <w:t xml:space="preserve">5.2. </w:t>
       </w:r>
-      <w:proofErr w:type="spellStart"/>
       <w:r>
         <w:rPr>
           <w:u w:val="single"/>
@@ -4559,7 +3958,6 @@
         </w:rPr>
         <w:t>almos</w:t>
       </w:r>
-      <w:proofErr w:type="spellEnd"/>
       <w:r>
         <w:rPr>
           <w:u w:val="single"/>
@@ -4612,7 +4010,6 @@
         </w:rPr>
         <w:t>Open, using VSC, the “</w:t>
       </w:r>
-      <w:proofErr w:type="spellStart"/>
       <w:r>
         <w:rPr>
           <w:lang w:val="en-US"/>
@@ -4623,28 +4020,7 @@
         <w:rPr>
           <w:lang w:val="en-US"/>
         </w:rPr>
-        <w:t>course_setup.ipynb</w:t>
-      </w:r>
-      <w:proofErr w:type="spellEnd"/>
-      <w:r>
-        <w:rPr>
-          <w:lang w:val="en-US"/>
-        </w:rPr>
-        <w:t xml:space="preserve">” </w:t>
-      </w:r>
-      <w:proofErr w:type="spellStart"/>
-      <w:r>
-        <w:rPr>
-          <w:lang w:val="en-US"/>
-        </w:rPr>
-        <w:t>Jupyter</w:t>
-      </w:r>
-      <w:proofErr w:type="spellEnd"/>
-      <w:r>
-        <w:rPr>
-          <w:lang w:val="en-US"/>
-        </w:rPr>
-        <w:t xml:space="preserve"> Notebook unzipped from the previous step</w:t>
+        <w:t>course_setup.ipynb” Jupyter Notebook unzipped from the previous step</w:t>
       </w:r>
       <w:r>
         <w:rPr>
@@ -4676,14 +4052,12 @@
         </w:rPr>
         <w:t>/</w:t>
       </w:r>
-      <w:proofErr w:type="spellStart"/>
       <w:r>
         <w:rPr>
           <w:lang w:val="en-US"/>
         </w:rPr>
         <w:t>Setup_and_testing</w:t>
       </w:r>
-      <w:proofErr w:type="spellEnd"/>
       <w:r>
         <w:rPr>
           <w:lang w:val="en-US"/>
@@ -4729,14 +4103,12 @@
         </w:rPr>
         <w:t xml:space="preserve">When VSC opens, select the </w:t>
       </w:r>
-      <w:proofErr w:type="spellStart"/>
       <w:r>
         <w:rPr>
           <w:lang w:val="en-US"/>
         </w:rPr>
         <w:t>almos</w:t>
       </w:r>
-      <w:proofErr w:type="spellEnd"/>
       <w:r>
         <w:rPr>
           <w:lang w:val="en-US"/>
@@ -4767,14 +4139,12 @@
         </w:rPr>
         <w:t>“</w:t>
       </w:r>
-      <w:proofErr w:type="spellStart"/>
       <w:r>
         <w:rPr>
           <w:lang w:val="en-US"/>
         </w:rPr>
         <w:t>almos</w:t>
       </w:r>
-      <w:proofErr w:type="spellEnd"/>
       <w:r>
         <w:rPr>
           <w:lang w:val="en-US"/>
@@ -5031,7 +4401,6 @@
         </w:rPr>
         <w:t>5. Close the “</w:t>
       </w:r>
-      <w:proofErr w:type="spellStart"/>
       <w:r>
         <w:rPr>
           <w:lang w:val="en-US"/>
@@ -5044,34 +4413,468 @@
           <w:szCs w:val="24"/>
           <w:lang w:val="en-US"/>
         </w:rPr>
-        <w:t>_course_setup.ipynb</w:t>
-      </w:r>
-      <w:proofErr w:type="spellEnd"/>
-      <w:r>
-        <w:rPr>
-          <w:sz w:val="24"/>
-          <w:szCs w:val="24"/>
-          <w:lang w:val="en-US"/>
-        </w:rPr>
-        <w:t xml:space="preserve">” </w:t>
-      </w:r>
-      <w:proofErr w:type="spellStart"/>
-      <w:r>
-        <w:rPr>
-          <w:sz w:val="24"/>
-          <w:szCs w:val="24"/>
-          <w:lang w:val="en-US"/>
-        </w:rPr>
-        <w:t>Jupyter</w:t>
-      </w:r>
-      <w:proofErr w:type="spellEnd"/>
-      <w:r>
-        <w:rPr>
-          <w:sz w:val="24"/>
-          <w:szCs w:val="24"/>
-          <w:lang w:val="en-US"/>
-        </w:rPr>
-        <w:t xml:space="preserve"> Notebook and, then, close VSC.</w:t>
+        <w:t>_course_setup.ipynb” Jupyter Notebook and, then, close VSC.</w:t>
+      </w:r>
+    </w:p>
+    <w:p>
+      <w:pPr>
+        <w:jc w:val="both"/>
+        <w:rPr>
+          <w:sz w:val="24"/>
+          <w:szCs w:val="24"/>
+          <w:lang w:val="en-US"/>
+        </w:rPr>
+      </w:pPr>
+    </w:p>
+    <w:p>
+      <w:pPr>
+        <w:pStyle w:val="Heading3"/>
+        <w:jc w:val="both"/>
+        <w:rPr>
+          <w:u w:val="single"/>
+          <w:lang w:val="en-US"/>
+        </w:rPr>
+      </w:pPr>
+      <w:r>
+        <w:rPr>
+          <w:u w:val="single"/>
+          <w:lang w:val="en-US"/>
+        </w:rPr>
+        <w:lastRenderedPageBreak/>
+        <w:t>5.</w:t>
+      </w:r>
+      <w:r>
+        <w:rPr>
+          <w:u w:val="single"/>
+          <w:lang w:val="en-US"/>
+        </w:rPr>
+        <w:t>3</w:t>
+      </w:r>
+      <w:r>
+        <w:rPr>
+          <w:u w:val="single"/>
+          <w:lang w:val="en-US"/>
+        </w:rPr>
+        <w:t xml:space="preserve">. </w:t>
+      </w:r>
+      <w:r>
+        <w:rPr>
+          <w:lang w:val="en-US"/>
+        </w:rPr>
+        <w:t>bayesian_ts</w:t>
+      </w:r>
+      <w:r>
+        <w:rPr>
+          <w:u w:val="single"/>
+          <w:lang w:val="en-US"/>
+        </w:rPr>
+        <w:t xml:space="preserve"> </w:t>
+      </w:r>
+      <w:r>
+        <w:rPr>
+          <w:u w:val="single"/>
+          <w:lang w:val="en-US"/>
+        </w:rPr>
+        <w:t>environment</w:t>
+      </w:r>
+    </w:p>
+    <w:p>
+      <w:pPr>
+        <w:pStyle w:val="Heading3"/>
+        <w:jc w:val="both"/>
+        <w:rPr>
+          <w:lang w:val="en-US"/>
+        </w:rPr>
+      </w:pPr>
+      <w:r>
+        <w:rPr>
+          <w:lang w:val="en-US"/>
+        </w:rPr>
+        <w:t>5.</w:t>
+      </w:r>
+      <w:r>
+        <w:rPr>
+          <w:lang w:val="en-US"/>
+        </w:rPr>
+        <w:t>3.</w:t>
+      </w:r>
+      <w:r>
+        <w:rPr>
+          <w:lang w:val="en-US"/>
+        </w:rPr>
+        <w:t xml:space="preserve">1. </w:t>
+      </w:r>
+      <w:r>
+        <w:rPr>
+          <w:lang w:val="en-US"/>
+        </w:rPr>
+        <w:t>Open, using VSC, the “</w:t>
+      </w:r>
+      <w:r>
+        <w:rPr>
+          <w:szCs w:val="24"/>
+          <w:lang w:val="en-US"/>
+        </w:rPr>
+        <w:t>BAYESIAN_TS_course_setup</w:t>
+      </w:r>
+      <w:r>
+        <w:rPr>
+          <w:lang w:val="en-US"/>
+        </w:rPr>
+        <w:t>.ipynb” Jupyter Notebook unzipped from the previous step</w:t>
+      </w:r>
+      <w:r>
+        <w:rPr>
+          <w:lang w:val="en-US"/>
+        </w:rPr>
+        <w:t xml:space="preserve"> (in the “</w:t>
+      </w:r>
+      <w:r>
+        <w:rPr>
+          <w:lang w:val="en-US"/>
+        </w:rPr>
+        <w:t>ML_course</w:t>
+      </w:r>
+      <w:r>
+        <w:rPr>
+          <w:lang w:val="en-US"/>
+        </w:rPr>
+        <w:t>/</w:t>
+      </w:r>
+      <w:r>
+        <w:rPr>
+          <w:lang w:val="en-US"/>
+        </w:rPr>
+        <w:t>Prerequisites</w:t>
+      </w:r>
+      <w:r>
+        <w:rPr>
+          <w:lang w:val="en-US"/>
+        </w:rPr>
+        <w:t>/</w:t>
+      </w:r>
+      <w:r>
+        <w:rPr>
+          <w:lang w:val="en-US"/>
+        </w:rPr>
+        <w:t>Setup_and_testing</w:t>
+      </w:r>
+      <w:r>
+        <w:rPr>
+          <w:lang w:val="en-US"/>
+        </w:rPr>
+        <w:t>” folder)</w:t>
+      </w:r>
+      <w:r>
+        <w:rPr>
+          <w:lang w:val="en-US"/>
+        </w:rPr>
+        <w:t>.</w:t>
+      </w:r>
+    </w:p>
+    <w:p>
+      <w:pPr>
+        <w:pStyle w:val="Heading3"/>
+        <w:jc w:val="both"/>
+        <w:rPr>
+          <w:lang w:val="en-US"/>
+        </w:rPr>
+      </w:pPr>
+      <w:r>
+        <w:rPr>
+          <w:lang w:val="en-US"/>
+        </w:rPr>
+        <w:t>5.</w:t>
+      </w:r>
+      <w:r>
+        <w:rPr>
+          <w:lang w:val="en-US"/>
+        </w:rPr>
+        <w:t>3</w:t>
+      </w:r>
+      <w:r>
+        <w:rPr>
+          <w:lang w:val="en-US"/>
+        </w:rPr>
+        <w:t xml:space="preserve">.2. </w:t>
+      </w:r>
+      <w:r>
+        <w:rPr>
+          <w:lang w:val="en-US"/>
+        </w:rPr>
+        <w:t xml:space="preserve">When VSC opens, select the </w:t>
+      </w:r>
+      <w:r>
+        <w:rPr>
+          <w:lang w:val="en-US"/>
+        </w:rPr>
+        <w:t>bayesian_ts</w:t>
+      </w:r>
+      <w:r>
+        <w:rPr>
+          <w:lang w:val="en-US"/>
+        </w:rPr>
+        <w:t xml:space="preserve"> kernel</w:t>
+      </w:r>
+      <w:r>
+        <w:rPr>
+          <w:lang w:val="en-US"/>
+        </w:rPr>
+        <w:t xml:space="preserve"> (see step 5.1.2, but this time with “bayesian_ts”)</w:t>
+      </w:r>
+    </w:p>
+    <w:p>
+      <w:pPr>
+        <w:pStyle w:val="Heading3"/>
+        <w:jc w:val="both"/>
+        <w:rPr>
+          <w:i/>
+          <w:iCs/>
+          <w:lang w:val="en-US"/>
+        </w:rPr>
+      </w:pPr>
+      <w:r>
+        <w:rPr>
+          <w:lang w:val="en-US"/>
+        </w:rPr>
+        <w:t>5.</w:t>
+      </w:r>
+      <w:r>
+        <w:rPr>
+          <w:lang w:val="en-US"/>
+        </w:rPr>
+        <w:t>3</w:t>
+      </w:r>
+      <w:r>
+        <w:rPr>
+          <w:lang w:val="en-US"/>
+        </w:rPr>
+        <w:t xml:space="preserve">.3. </w:t>
+      </w:r>
+      <w:r>
+        <w:rPr>
+          <w:lang w:val="en-US"/>
+        </w:rPr>
+        <w:t xml:space="preserve">Run </w:t>
+      </w:r>
+      <w:r>
+        <w:rPr>
+          <w:lang w:val="en-US"/>
+        </w:rPr>
+        <w:t>the</w:t>
+      </w:r>
+      <w:r>
+        <w:rPr>
+          <w:lang w:val="en-US"/>
+        </w:rPr>
+        <w:t xml:space="preserve"> </w:t>
+      </w:r>
+      <w:r>
+        <w:rPr>
+          <w:lang w:val="en-US"/>
+        </w:rPr>
+        <w:t xml:space="preserve">code </w:t>
+      </w:r>
+      <w:r>
+        <w:rPr>
+          <w:lang w:val="en-US"/>
+        </w:rPr>
+        <w:t>cell</w:t>
+      </w:r>
+      <w:r>
+        <w:rPr>
+          <w:lang w:val="en-US"/>
+        </w:rPr>
+        <w:t>s</w:t>
+      </w:r>
+      <w:r>
+        <w:rPr>
+          <w:lang w:val="en-US"/>
+        </w:rPr>
+        <w:t xml:space="preserve"> by </w:t>
+      </w:r>
+      <w:r>
+        <w:rPr>
+          <w:lang w:val="en-US"/>
+        </w:rPr>
+        <w:t xml:space="preserve">clicking “Run All”, </w:t>
+      </w:r>
+      <w:r>
+        <w:rPr>
+          <w:lang w:val="en-US"/>
+        </w:rPr>
+        <w:t>placing the cursor on each cell an</w:t>
+      </w:r>
+      <w:r>
+        <w:rPr>
+          <w:lang w:val="en-US"/>
+        </w:rPr>
+        <w:t>d</w:t>
+      </w:r>
+      <w:r>
+        <w:rPr>
+          <w:lang w:val="en-US"/>
+        </w:rPr>
+        <w:t xml:space="preserve"> pressing the play button</w:t>
+      </w:r>
+      <w:r>
+        <w:rPr>
+          <w:lang w:val="en-US"/>
+        </w:rPr>
+        <w:t>,</w:t>
+      </w:r>
+      <w:r>
+        <w:rPr>
+          <w:lang w:val="en-US"/>
+        </w:rPr>
+        <w:t xml:space="preserve"> or</w:t>
+      </w:r>
+      <w:r>
+        <w:rPr>
+          <w:lang w:val="en-US"/>
+        </w:rPr>
+        <w:t xml:space="preserve"> pressing</w:t>
+      </w:r>
+      <w:r>
+        <w:rPr>
+          <w:lang w:val="en-US"/>
+        </w:rPr>
+        <w:t xml:space="preserve"> </w:t>
+      </w:r>
+      <w:r>
+        <w:rPr>
+          <w:i/>
+          <w:iCs/>
+          <w:lang w:val="en-US"/>
+        </w:rPr>
+        <w:t xml:space="preserve">Shift </w:t>
+      </w:r>
+      <w:r>
+        <w:rPr>
+          <w:lang w:val="en-US"/>
+        </w:rPr>
+        <w:t xml:space="preserve">+ </w:t>
+      </w:r>
+      <w:r>
+        <w:rPr>
+          <w:i/>
+          <w:iCs/>
+          <w:lang w:val="en-US"/>
+        </w:rPr>
+        <w:t>Enter</w:t>
+      </w:r>
+      <w:r>
+        <w:rPr>
+          <w:i/>
+          <w:iCs/>
+          <w:lang w:val="en-US"/>
+        </w:rPr>
+        <w:t xml:space="preserve"> </w:t>
+      </w:r>
+      <w:r>
+        <w:rPr>
+          <w:lang w:val="en-US"/>
+        </w:rPr>
+        <w:t>(see step 5.1.3)</w:t>
+      </w:r>
+    </w:p>
+    <w:p>
+      <w:pPr>
+        <w:pStyle w:val="Heading3"/>
+        <w:jc w:val="both"/>
+        <w:rPr>
+          <w:lang w:val="en-US"/>
+        </w:rPr>
+      </w:pPr>
+      <w:r>
+        <w:rPr>
+          <w:lang w:val="en-US"/>
+        </w:rPr>
+        <w:t>5.</w:t>
+      </w:r>
+      <w:r>
+        <w:rPr>
+          <w:lang w:val="en-US"/>
+        </w:rPr>
+        <w:t>3</w:t>
+      </w:r>
+      <w:r>
+        <w:rPr>
+          <w:lang w:val="en-US"/>
+        </w:rPr>
+        <w:t xml:space="preserve">.4. </w:t>
+      </w:r>
+      <w:r>
+        <w:rPr>
+          <w:lang w:val="en-US"/>
+        </w:rPr>
+        <w:t>Check that each cell indicates that the library or program ha</w:t>
+      </w:r>
+      <w:r>
+        <w:rPr>
+          <w:lang w:val="en-US"/>
+        </w:rPr>
+        <w:t>s</w:t>
+      </w:r>
+      <w:r>
+        <w:rPr>
+          <w:lang w:val="en-US"/>
+        </w:rPr>
+        <w:t xml:space="preserve"> been installed correctly.</w:t>
+      </w:r>
+    </w:p>
+    <w:p>
+      <w:pPr>
+        <w:jc w:val="both"/>
+        <w:rPr>
+          <w:sz w:val="24"/>
+          <w:szCs w:val="24"/>
+          <w:lang w:val="en-US"/>
+        </w:rPr>
+      </w:pPr>
+      <w:r>
+        <w:rPr>
+          <w:sz w:val="24"/>
+          <w:szCs w:val="24"/>
+          <w:lang w:val="en-US"/>
+        </w:rPr>
+        <w:t>5.</w:t>
+      </w:r>
+      <w:r>
+        <w:rPr>
+          <w:lang w:val="en-US"/>
+        </w:rPr>
+        <w:t>3</w:t>
+      </w:r>
+      <w:r>
+        <w:rPr>
+          <w:lang w:val="en-US"/>
+        </w:rPr>
+        <w:t>.</w:t>
+      </w:r>
+      <w:r>
+        <w:rPr>
+          <w:sz w:val="24"/>
+          <w:szCs w:val="24"/>
+          <w:lang w:val="en-US"/>
+        </w:rPr>
+        <w:t>5. Close the “</w:t>
+      </w:r>
+      <w:r>
+        <w:rPr>
+          <w:sz w:val="24"/>
+          <w:szCs w:val="24"/>
+          <w:lang w:val="en-US"/>
+        </w:rPr>
+        <w:t>BAYESIAN_TS_course</w:t>
+      </w:r>
+      <w:r>
+        <w:rPr>
+          <w:sz w:val="24"/>
+          <w:szCs w:val="24"/>
+          <w:lang w:val="en-US"/>
+        </w:rPr>
+        <w:t>_setup.ipynb” Jupyter Notebook and, then, close VSC.</w:t>
       </w:r>
     </w:p>
     <w:p>
@@ -5165,64 +4968,94 @@
       <w:pPr>
         <w:jc w:val="both"/>
         <w:rPr>
-          <w:lang w:val="en-US"/>
-        </w:rPr>
-      </w:pPr>
-      <w:r>
-        <w:rPr>
-          <w:lang w:val="en-US"/>
-        </w:rPr>
-        <w:t>Try to open a CSV file from the course folder</w:t>
-      </w:r>
-      <w:r>
-        <w:rPr>
-          <w:lang w:val="en-US"/>
-        </w:rPr>
-        <w:t xml:space="preserve">, for example: </w:t>
+          <w:sz w:val="24"/>
+          <w:szCs w:val="24"/>
+          <w:lang w:val="en-US"/>
+        </w:rPr>
+      </w:pPr>
+      <w:r>
+        <w:rPr>
+          <w:sz w:val="24"/>
+          <w:szCs w:val="24"/>
+          <w:lang w:val="en-US"/>
+        </w:rPr>
+        <w:t xml:space="preserve">Try to open a CSV file from the course folder, for example: </w:t>
       </w:r>
       <w:r>
         <w:rPr>
           <w:rFonts w:cs="Courier New"/>
-          <w:lang w:val="en-US"/>
-        </w:rPr>
-        <w:t>test.csv</w:t>
+          <w:sz w:val="24"/>
+          <w:szCs w:val="24"/>
+          <w:lang w:val="en-US"/>
+        </w:rPr>
+        <w:t xml:space="preserve">test.csv (from </w:t>
       </w:r>
       <w:r>
         <w:rPr>
           <w:rFonts w:cs="Courier New"/>
-          <w:lang w:val="en-US"/>
-        </w:rPr>
-        <w:t xml:space="preserve"> (from </w:t>
-      </w:r>
-      <w:proofErr w:type="spellStart"/>
+          <w:sz w:val="24"/>
+          <w:szCs w:val="24"/>
+          <w:lang w:val="en-US"/>
+        </w:rPr>
+        <w:t>the “</w:t>
+      </w:r>
       <w:r>
         <w:rPr>
           <w:rFonts w:cs="Courier New"/>
-          <w:lang w:val="en-US"/>
-        </w:rPr>
-        <w:t>set_up</w:t>
-      </w:r>
-      <w:proofErr w:type="spellEnd"/>
+          <w:sz w:val="24"/>
+          <w:szCs w:val="24"/>
+          <w:lang w:val="en-US"/>
+        </w:rPr>
+        <w:t>Setup_and_testing</w:t>
+      </w:r>
       <w:r>
         <w:rPr>
           <w:rFonts w:cs="Courier New"/>
-          <w:lang w:val="en-US"/>
-        </w:rPr>
-        <w:t xml:space="preserve"> folder)</w:t>
-      </w:r>
-    </w:p>
-    <w:p>
-      <w:pPr>
-        <w:jc w:val="both"/>
-        <w:rPr>
-          <w:lang w:val="en-US"/>
-        </w:rPr>
-      </w:pPr>
-      <w:r>
-        <w:rPr>
-          <w:lang w:val="en-US"/>
-        </w:rPr>
-        <w:lastRenderedPageBreak/>
+          <w:sz w:val="24"/>
+          <w:szCs w:val="24"/>
+          <w:lang w:val="en-US"/>
+        </w:rPr>
+        <w:t>”</w:t>
+      </w:r>
+      <w:r>
+        <w:rPr>
+          <w:rFonts w:cs="Courier New"/>
+          <w:sz w:val="24"/>
+          <w:szCs w:val="24"/>
+          <w:lang w:val="en-US"/>
+        </w:rPr>
+        <w:t xml:space="preserve"> folder</w:t>
+      </w:r>
+      <w:r>
+        <w:rPr>
+          <w:rFonts w:cs="Courier New"/>
+          <w:sz w:val="24"/>
+          <w:szCs w:val="24"/>
+          <w:lang w:val="en-US"/>
+        </w:rPr>
+        <w:t>, see step 4.2.1</w:t>
+      </w:r>
+      <w:r>
+        <w:rPr>
+          <w:rFonts w:cs="Courier New"/>
+          <w:sz w:val="24"/>
+          <w:szCs w:val="24"/>
+          <w:lang w:val="en-US"/>
+        </w:rPr>
+        <w:t>)</w:t>
+      </w:r>
+    </w:p>
+    <w:p>
+      <w:pPr>
+        <w:jc w:val="both"/>
+        <w:rPr>
+          <w:lang w:val="en-US"/>
+        </w:rPr>
+      </w:pPr>
+      <w:r>
+        <w:rPr>
+          <w:lang w:val="en-US"/>
+        </w:rPr>
         <w:t xml:space="preserve">If when opening a CSV file everything is condensed into a single column, you can change this in </w:t>
       </w:r>
       <w:r>
@@ -5318,16 +5151,8 @@
         <w:rPr>
           <w:lang w:val="en-US"/>
         </w:rPr>
-        <w:t xml:space="preserve">7. Testing </w:t>
-      </w:r>
-      <w:proofErr w:type="spellStart"/>
-      <w:r>
-        <w:rPr>
-          <w:lang w:val="en-US"/>
-        </w:rPr>
-        <w:t>easyROB</w:t>
-      </w:r>
-      <w:proofErr w:type="spellEnd"/>
+        <w:t>7. Testing easyROB</w:t>
+      </w:r>
     </w:p>
     <w:p>
       <w:pPr>
@@ -5395,17 +5220,8 @@
             <w:rStyle w:val="Hyperlink"/>
             <w:lang w:val="en-US"/>
           </w:rPr>
-          <w:t xml:space="preserve">How to install </w:t>
+          <w:t>How to install EasyROB</w:t>
         </w:r>
-        <w:proofErr w:type="spellStart"/>
-        <w:r>
-          <w:rPr>
-            <w:rStyle w:val="Hyperlink"/>
-            <w:lang w:val="en-US"/>
-          </w:rPr>
-          <w:t>EasyROB</w:t>
-        </w:r>
-        <w:proofErr w:type="spellEnd"/>
       </w:hyperlink>
     </w:p>
     <w:p>
@@ -5419,21 +5235,8 @@
         <w:rPr>
           <w:lang w:val="en-US"/>
         </w:rPr>
-        <w:t xml:space="preserve">The video explains how to download the correct file, extract it, launch </w:t>
-      </w:r>
-      <w:proofErr w:type="spellStart"/>
-      <w:r>
-        <w:rPr>
-          <w:lang w:val="en-US"/>
-        </w:rPr>
-        <w:t>easyROB</w:t>
-      </w:r>
-      <w:proofErr w:type="spellEnd"/>
-      <w:r>
-        <w:rPr>
-          <w:lang w:val="en-US"/>
-        </w:rPr>
-        <w:t>, and what to do if Windows shows a security warning.</w:t>
+        <w:lastRenderedPageBreak/>
+        <w:t>The video explains how to download the correct file, extract it, launch easyROB, and what to do if Windows shows a security warning.</w:t>
       </w:r>
     </w:p>
     <w:p>
@@ -5672,7 +5475,7 @@
       <w:r>
         <w:rPr>
           <w:b/>
-          <w:color w:val="FF0000"/>
+          <w:color w:val="C00000"/>
           <w:lang w:val="en-US"/>
         </w:rPr>
         <w:t>Fallback Method</w:t>
@@ -5680,14 +5483,14 @@
       <w:r>
         <w:rPr>
           <w:b/>
-          <w:color w:val="FF0000"/>
+          <w:color w:val="C00000"/>
           <w:lang w:val="en-US"/>
         </w:rPr>
         <w:t>!</w:t>
       </w:r>
       <w:r>
         <w:rPr>
-          <w:color w:val="FF0000"/>
+          <w:color w:val="C00000"/>
           <w:lang w:val="en-US"/>
         </w:rPr>
         <w:t xml:space="preserve"> </w:t>
@@ -5710,21 +5513,7 @@
         <w:rPr>
           <w:lang w:val="en-US"/>
         </w:rPr>
-        <w:t xml:space="preserve">If the portable version does not launch correctly (for example, nothing happens, the window closes immediately, or you see environment/Qt errors), you can run </w:t>
-      </w:r>
-      <w:proofErr w:type="spellStart"/>
-      <w:r>
-        <w:rPr>
-          <w:lang w:val="en-US"/>
-        </w:rPr>
-        <w:t>easyROB</w:t>
-      </w:r>
-      <w:proofErr w:type="spellEnd"/>
-      <w:r>
-        <w:rPr>
-          <w:lang w:val="en-US"/>
-        </w:rPr>
-        <w:t xml:space="preserve"> using the standard Terminal method.</w:t>
+        <w:t>If the portable version does not launch correctly (for example, nothing happens, the window closes immediately, or you see environment/Qt errors), you can run easyROB using the standard Terminal method.</w:t>
       </w:r>
     </w:p>
     <w:p>
@@ -5804,7 +5593,6 @@
         <w:rPr>
           <w:lang w:val="en-US"/>
         </w:rPr>
-        <w:lastRenderedPageBreak/>
         <w:t>A brief description of what happens</w:t>
       </w:r>
     </w:p>
@@ -6088,23 +5876,14 @@
           <w:lang w:val="en-US"/>
         </w:rPr>
       </w:pPr>
-      <w:proofErr w:type="spellStart"/>
       <w:r>
         <w:rPr>
           <w:rFonts w:ascii="Courier New" w:eastAsia="Courier New" w:hAnsi="Courier New"/>
           <w:sz w:val="20"/>
           <w:lang w:val="en-US"/>
         </w:rPr>
-        <w:t>chmod</w:t>
-      </w:r>
-      <w:proofErr w:type="spellEnd"/>
-      <w:r>
-        <w:rPr>
-          <w:rFonts w:ascii="Courier New" w:eastAsia="Courier New" w:hAnsi="Courier New"/>
-          <w:sz w:val="20"/>
-          <w:lang w:val="en-US"/>
-        </w:rPr>
-        <w:t xml:space="preserve"> +x run_easyrob.sh</w:t>
+        <w:lastRenderedPageBreak/>
+        <w:t>chmod +x run_easyrob.sh</w:t>
       </w:r>
     </w:p>
     <w:p>
@@ -6191,14 +5970,14 @@
       <w:r>
         <w:rPr>
           <w:b/>
-          <w:color w:val="FF0000"/>
+          <w:color w:val="C00000"/>
           <w:lang w:val="en-US"/>
         </w:rPr>
         <w:t>Fallback Method!</w:t>
       </w:r>
       <w:r>
         <w:rPr>
-          <w:color w:val="FF0000"/>
+          <w:color w:val="C00000"/>
           <w:lang w:val="en-US"/>
         </w:rPr>
         <w:t xml:space="preserve"> </w:t>
@@ -6221,21 +6000,7 @@
         <w:rPr>
           <w:lang w:val="en-US"/>
         </w:rPr>
-        <w:t xml:space="preserve">If the portable version does not launch correctly (for example, nothing happens, the window closes immediately, or you see environment/Qt errors), you can run </w:t>
-      </w:r>
-      <w:proofErr w:type="spellStart"/>
-      <w:r>
-        <w:rPr>
-          <w:lang w:val="en-US"/>
-        </w:rPr>
-        <w:t>easyROB</w:t>
-      </w:r>
-      <w:proofErr w:type="spellEnd"/>
-      <w:r>
-        <w:rPr>
-          <w:lang w:val="en-US"/>
-        </w:rPr>
-        <w:t xml:space="preserve"> using the standard Terminal method. </w:t>
+        <w:t xml:space="preserve">If the portable version does not launch correctly (for example, nothing happens, the window closes immediately, or you see environment/Qt errors), you can run easyROB using the standard Terminal method. </w:t>
       </w:r>
     </w:p>
     <w:p>
@@ -6392,49 +6157,21 @@
         <w:rPr>
           <w:lang w:val="en-US"/>
         </w:rPr>
-        <w:t xml:space="preserve"> Testing </w:t>
-      </w:r>
-      <w:proofErr w:type="spellStart"/>
-      <w:r>
-        <w:rPr>
-          <w:lang w:val="en-US"/>
-        </w:rPr>
-        <w:t>easyROB</w:t>
-      </w:r>
-      <w:proofErr w:type="spellEnd"/>
-      <w:r>
-        <w:rPr>
-          <w:lang w:val="en-US"/>
-        </w:rPr>
-        <w:t xml:space="preserve"> from Terminal (macOS / Fallback Method)</w:t>
-      </w:r>
-    </w:p>
-    <w:p>
-      <w:pPr>
-        <w:jc w:val="both"/>
-        <w:rPr>
-          <w:lang w:val="en-US"/>
-        </w:rPr>
-      </w:pPr>
-      <w:r>
-        <w:rPr>
-          <w:lang w:val="en-US"/>
-        </w:rPr>
-        <w:t xml:space="preserve">This method runs </w:t>
-      </w:r>
-      <w:proofErr w:type="spellStart"/>
-      <w:r>
-        <w:rPr>
-          <w:lang w:val="en-US"/>
-        </w:rPr>
-        <w:t>easyROB</w:t>
-      </w:r>
-      <w:proofErr w:type="spellEnd"/>
-      <w:r>
-        <w:rPr>
-          <w:lang w:val="en-US"/>
-        </w:rPr>
-        <w:t xml:space="preserve"> using a standard ROBERT installation (non-portable).</w:t>
+        <w:t xml:space="preserve"> Testing easyROB from Terminal (macOS / Fallback Method)</w:t>
+      </w:r>
+    </w:p>
+    <w:p>
+      <w:pPr>
+        <w:jc w:val="both"/>
+        <w:rPr>
+          <w:lang w:val="en-US"/>
+        </w:rPr>
+      </w:pPr>
+      <w:r>
+        <w:rPr>
+          <w:lang w:val="en-US"/>
+        </w:rPr>
+        <w:t>This method runs easyROB using a standard ROBERT installation (non-portable).</w:t>
       </w:r>
     </w:p>
     <w:p>
@@ -6536,7 +6273,6 @@
         <w:rPr>
           <w:lang w:val="en-US"/>
         </w:rPr>
-        <w:lastRenderedPageBreak/>
         <w:t xml:space="preserve">Open </w:t>
       </w:r>
       <w:r>
@@ -6599,21 +6335,7 @@
         <w:rPr>
           <w:lang w:val="en-US"/>
         </w:rPr>
-        <w:t xml:space="preserve">Press </w:t>
-      </w:r>
-      <w:proofErr w:type="spellStart"/>
-      <w:r>
-        <w:rPr>
-          <w:lang w:val="en-US"/>
-        </w:rPr>
-        <w:t>Cmd</w:t>
-      </w:r>
-      <w:proofErr w:type="spellEnd"/>
-      <w:r>
-        <w:rPr>
-          <w:lang w:val="en-US"/>
-        </w:rPr>
-        <w:t xml:space="preserve"> + Space, type Terminal, and press Enter.</w:t>
+        <w:t>Press Cmd + Space, type Terminal, and press Enter.</w:t>
       </w:r>
     </w:p>
     <w:p>
@@ -6694,21 +6416,7 @@
         <w:rPr>
           <w:lang w:val="en-US"/>
         </w:rPr>
-        <w:t xml:space="preserve">Activate the </w:t>
-      </w:r>
-      <w:proofErr w:type="spellStart"/>
-      <w:r>
-        <w:rPr>
-          <w:lang w:val="en-US"/>
-        </w:rPr>
-        <w:t>conda</w:t>
-      </w:r>
-      <w:proofErr w:type="spellEnd"/>
-      <w:r>
-        <w:rPr>
-          <w:lang w:val="en-US"/>
-        </w:rPr>
-        <w:t xml:space="preserve"> environment where ROBERT is installed:</w:t>
+        <w:t>Activate the conda environment where ROBERT is installed:</w:t>
       </w:r>
     </w:p>
     <w:p>
@@ -6731,34 +6439,22 @@
           <w:lang w:val="en-US"/>
         </w:rPr>
       </w:pPr>
-      <w:proofErr w:type="spellStart"/>
       <w:r>
         <w:rPr>
           <w:rFonts w:ascii="Courier New" w:eastAsia="Courier New" w:hAnsi="Courier New"/>
           <w:sz w:val="20"/>
           <w:lang w:val="en-US"/>
         </w:rPr>
-        <w:t>conda</w:t>
-      </w:r>
-      <w:proofErr w:type="spellEnd"/>
+        <w:t xml:space="preserve">conda activate </w:t>
+      </w:r>
       <w:r>
         <w:rPr>
           <w:rFonts w:ascii="Courier New" w:eastAsia="Courier New" w:hAnsi="Courier New"/>
           <w:sz w:val="20"/>
           <w:lang w:val="en-US"/>
         </w:rPr>
-        <w:t xml:space="preserve"> activate </w:t>
-      </w:r>
-      <w:proofErr w:type="spellStart"/>
-      <w:r>
-        <w:rPr>
-          <w:rFonts w:ascii="Courier New" w:eastAsia="Courier New" w:hAnsi="Courier New"/>
-          <w:sz w:val="20"/>
-          <w:lang w:val="en-US"/>
-        </w:rPr>
         <w:t>cheminf</w:t>
       </w:r>
-      <w:proofErr w:type="spellEnd"/>
     </w:p>
     <w:p>
       <w:pPr>
@@ -7060,21 +6756,7 @@
         <w:rPr>
           <w:lang w:val="en-US"/>
         </w:rPr>
-        <w:t xml:space="preserve">aunch </w:t>
-      </w:r>
-      <w:proofErr w:type="spellStart"/>
-      <w:r>
-        <w:rPr>
-          <w:lang w:val="en-US"/>
-        </w:rPr>
-        <w:t>easyROB</w:t>
-      </w:r>
-      <w:proofErr w:type="spellEnd"/>
-      <w:r>
-        <w:rPr>
-          <w:lang w:val="en-US"/>
-        </w:rPr>
-        <w:t xml:space="preserve"> by running:</w:t>
+        <w:t>aunch easyROB by running:</w:t>
       </w:r>
     </w:p>
     <w:p>

</xml_diff>

<commit_message>
1. Updating easyrob installation
</commit_message>
<xml_diff>
--- a/Prerequisites/Instructions_Setup.docx
+++ b/Prerequisites/Instructions_Setup.docx
@@ -4441,40 +4441,26 @@
           <w:lang w:val="en-US"/>
         </w:rPr>
         <w:lastRenderedPageBreak/>
-        <w:t>5.</w:t>
+        <w:t xml:space="preserve">5.3. </w:t>
+      </w:r>
+      <w:r>
+        <w:rPr>
+          <w:lang w:val="en-US"/>
+        </w:rPr>
+        <w:t>bayesian_ts</w:t>
       </w:r>
       <w:r>
         <w:rPr>
           <w:u w:val="single"/>
           <w:lang w:val="en-US"/>
         </w:rPr>
-        <w:t>3</w:t>
+        <w:t xml:space="preserve"> </w:t>
       </w:r>
       <w:r>
         <w:rPr>
           <w:u w:val="single"/>
           <w:lang w:val="en-US"/>
         </w:rPr>
-        <w:t xml:space="preserve">. </w:t>
-      </w:r>
-      <w:r>
-        <w:rPr>
-          <w:lang w:val="en-US"/>
-        </w:rPr>
-        <w:t>bayesian_ts</w:t>
-      </w:r>
-      <w:r>
-        <w:rPr>
-          <w:u w:val="single"/>
-          <w:lang w:val="en-US"/>
-        </w:rPr>
-        <w:t xml:space="preserve"> </w:t>
-      </w:r>
-      <w:r>
-        <w:rPr>
-          <w:u w:val="single"/>
-          <w:lang w:val="en-US"/>
-        </w:rPr>
         <w:t>environment</w:t>
       </w:r>
     </w:p>
@@ -4490,19 +4476,7 @@
         <w:rPr>
           <w:lang w:val="en-US"/>
         </w:rPr>
-        <w:t>5.</w:t>
-      </w:r>
-      <w:r>
-        <w:rPr>
-          <w:lang w:val="en-US"/>
-        </w:rPr>
-        <w:t>3.</w:t>
-      </w:r>
-      <w:r>
-        <w:rPr>
-          <w:lang w:val="en-US"/>
-        </w:rPr>
-        <w:t xml:space="preserve">1. </w:t>
+        <w:t xml:space="preserve">5.3.1. </w:t>
       </w:r>
       <w:r>
         <w:rPr>
@@ -5173,43 +5147,49 @@
         <w:rPr>
           <w:lang w:val="en-US"/>
         </w:rPr>
-        <w:t xml:space="preserve"> Portable Version (Windows)</w:t>
-      </w:r>
-    </w:p>
-    <w:p>
-      <w:pPr>
-        <w:jc w:val="both"/>
-        <w:rPr>
-          <w:b/>
-          <w:lang w:val="en-US"/>
-        </w:rPr>
-      </w:pPr>
-      <w:r>
-        <w:rPr>
-          <w:b/>
-          <w:lang w:val="en-US"/>
-        </w:rPr>
-        <w:t>Option A — Video Tutorial (Recommended)</w:t>
-      </w:r>
-    </w:p>
-    <w:p>
-      <w:pPr>
-        <w:jc w:val="both"/>
-        <w:rPr>
-          <w:lang w:val="en-US"/>
-        </w:rPr>
-      </w:pPr>
-      <w:r>
-        <w:rPr>
-          <w:lang w:val="en-US"/>
-        </w:rPr>
-        <w:t>If you prefer a visual step-by-step explanation, please watch the installation video using the hyperlink provided in this document.</w:t>
-      </w:r>
-    </w:p>
-    <w:p>
-      <w:pPr>
-        <w:ind w:firstLine="284"/>
-        <w:jc w:val="both"/>
+        <w:t xml:space="preserve"> </w:t>
+      </w:r>
+      <w:r>
+        <w:rPr>
+          <w:lang w:val="en-US"/>
+        </w:rPr>
+        <w:t>easyROB executable</w:t>
+      </w:r>
+      <w:r>
+        <w:rPr>
+          <w:lang w:val="en-US"/>
+        </w:rPr>
+        <w:t xml:space="preserve"> (</w:t>
+      </w:r>
+      <w:r>
+        <w:rPr>
+          <w:lang w:val="en-US"/>
+        </w:rPr>
+        <w:t>preferred option</w:t>
+      </w:r>
+      <w:r>
+        <w:rPr>
+          <w:lang w:val="en-US"/>
+        </w:rPr>
+        <w:t>)</w:t>
+      </w:r>
+    </w:p>
+    <w:p>
+      <w:pPr>
+        <w:jc w:val="both"/>
+        <w:rPr>
+          <w:lang w:val="en-US"/>
+        </w:rPr>
+      </w:pPr>
+      <w:r>
+        <w:rPr>
+          <w:lang w:val="en-US"/>
+        </w:rPr>
+        <w:t>Follow the instructions from:</w:t>
+      </w:r>
+    </w:p>
+    <w:p>
+      <w:pPr>
         <w:rPr>
           <w:lang w:val="en-US"/>
         </w:rPr>
@@ -5220,61 +5200,97 @@
             <w:rStyle w:val="Hyperlink"/>
             <w:lang w:val="en-US"/>
           </w:rPr>
-          <w:t>How to install EasyROB</w:t>
+          <w:t>https://github.com/MiguelMartzFdez/easyROB</w:t>
         </w:r>
       </w:hyperlink>
-    </w:p>
-    <w:p>
-      <w:pPr>
-        <w:jc w:val="both"/>
-        <w:rPr>
-          <w:lang w:val="en-US"/>
-        </w:rPr>
-      </w:pPr>
-      <w:r>
-        <w:rPr>
-          <w:lang w:val="en-US"/>
-        </w:rPr>
-        <w:lastRenderedPageBreak/>
-        <w:t>The video explains how to download the correct file, extract it, launch easyROB, and what to do if Windows shows a security warning.</w:t>
-      </w:r>
-    </w:p>
-    <w:p>
-      <w:pPr>
-        <w:jc w:val="both"/>
-        <w:rPr>
-          <w:lang w:val="en-US"/>
-        </w:rPr>
-      </w:pPr>
-    </w:p>
-    <w:p>
-      <w:pPr>
-        <w:jc w:val="both"/>
-        <w:rPr>
-          <w:b/>
-          <w:lang w:val="en-US"/>
-        </w:rPr>
-      </w:pPr>
-      <w:r>
-        <w:rPr>
-          <w:b/>
-          <w:lang w:val="en-US"/>
-        </w:rPr>
-        <w:t>Option B — Written Installation Instructions</w:t>
-      </w:r>
-    </w:p>
-    <w:p>
-      <w:pPr>
-        <w:jc w:val="both"/>
-        <w:rPr>
-          <w:lang w:val="en-US"/>
-        </w:rPr>
-      </w:pPr>
-      <w:r>
-        <w:rPr>
-          <w:lang w:val="en-US"/>
-        </w:rPr>
-        <w:t>For Windows users, installation is simple and takes only a few minutes.</w:t>
+      <w:r>
+        <w:rPr>
+          <w:lang w:val="en-US"/>
+        </w:rPr>
+        <w:t xml:space="preserve"> </w:t>
+      </w:r>
+    </w:p>
+    <w:p>
+      <w:pPr>
+        <w:rPr>
+          <w:lang w:val="en-US"/>
+        </w:rPr>
+      </w:pPr>
+    </w:p>
+    <w:p>
+      <w:pPr>
+        <w:pStyle w:val="Heading2"/>
+        <w:ind w:firstLine="0"/>
+        <w:jc w:val="both"/>
+        <w:rPr>
+          <w:lang w:val="en-US"/>
+        </w:rPr>
+      </w:pPr>
+    </w:p>
+    <w:p>
+      <w:pPr>
+        <w:pStyle w:val="Heading2"/>
+        <w:ind w:firstLine="0"/>
+        <w:jc w:val="both"/>
+        <w:rPr>
+          <w:lang w:val="en-US"/>
+        </w:rPr>
+      </w:pPr>
+      <w:r>
+        <w:rPr>
+          <w:lang w:val="en-US"/>
+        </w:rPr>
+        <w:t>7.</w:t>
+      </w:r>
+      <w:r>
+        <w:rPr>
+          <w:lang w:val="en-US"/>
+        </w:rPr>
+        <w:t>2</w:t>
+      </w:r>
+      <w:r>
+        <w:rPr>
+          <w:lang w:val="en-US"/>
+        </w:rPr>
+        <w:t>.</w:t>
+      </w:r>
+      <w:r>
+        <w:rPr>
+          <w:lang w:val="en-US"/>
+        </w:rPr>
+        <w:t xml:space="preserve"> Portable </w:t>
+      </w:r>
+      <w:r>
+        <w:rPr>
+          <w:lang w:val="en-US"/>
+        </w:rPr>
+        <w:t>v</w:t>
+      </w:r>
+      <w:r>
+        <w:rPr>
+          <w:lang w:val="en-US"/>
+        </w:rPr>
+        <w:t xml:space="preserve">ersion </w:t>
+      </w:r>
+      <w:r>
+        <w:rPr>
+          <w:lang w:val="en-US"/>
+        </w:rPr>
+        <w:t>(plan B)</w:t>
+      </w:r>
+    </w:p>
+    <w:p>
+      <w:pPr>
+        <w:jc w:val="both"/>
+        <w:rPr>
+          <w:lang w:val="en-US"/>
+        </w:rPr>
+      </w:pPr>
+      <w:r>
+        <w:rPr>
+          <w:lang w:val="en-US"/>
+        </w:rPr>
+        <w:t>Follow the instructions from:</w:t>
       </w:r>
     </w:p>
     <w:p>
@@ -5282,46 +5298,105 @@
         <w:pStyle w:val="ListParagraph"/>
         <w:ind w:left="0"/>
         <w:jc w:val="both"/>
-        <w:rPr>
-          <w:lang w:val="en-US"/>
-        </w:rPr>
-      </w:pPr>
-      <w:r>
-        <w:rPr>
-          <w:bCs/>
-          <w:lang w:val="en-US"/>
-        </w:rPr>
-        <w:t>7.1B.1.</w:t>
-      </w:r>
-      <w:r>
-        <w:rPr>
-          <w:bCs/>
-          <w:lang w:val="en-US"/>
-        </w:rPr>
-        <w:t>Go to the Releases page and scroll down to the “Assets” section.</w:t>
-      </w:r>
-    </w:p>
-    <w:p>
-      <w:pPr>
-        <w:pStyle w:val="ListParagraph"/>
-        <w:ind w:left="0"/>
-        <w:jc w:val="both"/>
-        <w:rPr>
-          <w:lang w:val="en-US"/>
-        </w:rPr>
-      </w:pPr>
-      <w:hyperlink r:id="rId20" w:history="1">
+      </w:pPr>
+      <w:hyperlink r:id="rId20" w:tgtFrame="_blank" w:history="1">
         <w:r>
           <w:rPr>
             <w:rStyle w:val="Hyperlink"/>
-            <w:lang w:val="en-US"/>
           </w:rPr>
-          <w:t>https://github.com/MiguelMartzFdez/easyROB/releases</w:t>
+          <w:t>https://github.com/MiguelMartzFdez/easyROB_portable</w:t>
         </w:r>
       </w:hyperlink>
     </w:p>
     <w:p>
       <w:pPr>
+        <w:pStyle w:val="Heading2"/>
+        <w:ind w:firstLine="0"/>
+        <w:jc w:val="both"/>
+        <w:rPr>
+          <w:lang w:val="en-US"/>
+        </w:rPr>
+      </w:pPr>
+    </w:p>
+    <w:p>
+      <w:pPr>
+        <w:pStyle w:val="Heading2"/>
+        <w:ind w:firstLine="0"/>
+        <w:jc w:val="both"/>
+        <w:rPr>
+          <w:lang w:val="en-US"/>
+        </w:rPr>
+      </w:pPr>
+      <w:r>
+        <w:rPr>
+          <w:lang w:val="en-US"/>
+        </w:rPr>
+        <w:t>7.3</w:t>
+      </w:r>
+      <w:r>
+        <w:rPr>
+          <w:lang w:val="en-US"/>
+        </w:rPr>
+        <w:t>.</w:t>
+      </w:r>
+      <w:r>
+        <w:rPr>
+          <w:lang w:val="en-US"/>
+        </w:rPr>
+        <w:t xml:space="preserve"> easyROB from </w:t>
+      </w:r>
+      <w:r>
+        <w:rPr>
+          <w:lang w:val="en-US"/>
+        </w:rPr>
+        <w:t>t</w:t>
+      </w:r>
+      <w:r>
+        <w:rPr>
+          <w:lang w:val="en-US"/>
+        </w:rPr>
+        <w:t>erminal</w:t>
+      </w:r>
+      <w:r>
+        <w:rPr>
+          <w:lang w:val="en-US"/>
+        </w:rPr>
+        <w:t xml:space="preserve"> (plan C)</w:t>
+      </w:r>
+    </w:p>
+    <w:p>
+      <w:pPr>
+        <w:jc w:val="both"/>
+        <w:rPr>
+          <w:lang w:val="en-US"/>
+        </w:rPr>
+      </w:pPr>
+      <w:r>
+        <w:rPr>
+          <w:lang w:val="en-US"/>
+        </w:rPr>
+        <w:t>This method runs easyROB using a standard ROBERT installation (non-portable).</w:t>
+      </w:r>
+    </w:p>
+    <w:p>
+      <w:pPr>
+        <w:pStyle w:val="Heading3"/>
+        <w:jc w:val="both"/>
+        <w:rPr>
+          <w:b/>
+          <w:lang w:val="en-US"/>
+        </w:rPr>
+      </w:pPr>
+      <w:r>
+        <w:rPr>
+          <w:b/>
+          <w:lang w:val="en-US"/>
+        </w:rPr>
+        <w:t>Steps</w:t>
+      </w:r>
+    </w:p>
+    <w:p>
+      <w:pPr>
         <w:pStyle w:val="ListParagraph"/>
         <w:ind w:left="0"/>
         <w:jc w:val="both"/>
@@ -5329,6 +5404,48 @@
           <w:lang w:val="en-US"/>
         </w:rPr>
       </w:pPr>
+      <w:r>
+        <w:rPr>
+          <w:lang w:val="en-US"/>
+        </w:rPr>
+        <w:t xml:space="preserve">7.3.1. </w:t>
+      </w:r>
+      <w:r>
+        <w:rPr>
+          <w:lang w:val="en-US"/>
+        </w:rPr>
+        <w:t>Open a</w:t>
+      </w:r>
+      <w:r>
+        <w:rPr>
+          <w:lang w:val="en-US"/>
+        </w:rPr>
+        <w:t>n Anaconda Prompt (Windows) or</w:t>
+      </w:r>
+      <w:r>
+        <w:rPr>
+          <w:lang w:val="en-US"/>
+        </w:rPr>
+        <w:t xml:space="preserve"> </w:t>
+      </w:r>
+      <w:r>
+        <w:rPr>
+          <w:lang w:val="en-US"/>
+        </w:rPr>
+        <w:t>Terminal</w:t>
+      </w:r>
+      <w:r>
+        <w:rPr>
+          <w:lang w:val="en-US"/>
+        </w:rPr>
+        <w:t xml:space="preserve"> (macOS/Linux)</w:t>
+      </w:r>
+      <w:r>
+        <w:rPr>
+          <w:lang w:val="en-US"/>
+        </w:rPr>
+        <w:t>.</w:t>
+      </w:r>
     </w:p>
     <w:p>
       <w:pPr>
@@ -5336,30 +5453,9 @@
         <w:ind w:left="0"/>
         <w:jc w:val="both"/>
         <w:rPr>
-          <w:b/>
-          <w:lang w:val="en-US"/>
-        </w:rPr>
-      </w:pPr>
-      <w:r>
-        <w:rPr>
-          <w:bCs/>
-          <w:lang w:val="en-US"/>
-        </w:rPr>
-        <w:t xml:space="preserve">7.1B.2. </w:t>
-      </w:r>
-      <w:r>
-        <w:rPr>
-          <w:lang w:val="en-US"/>
-        </w:rPr>
-        <w:t xml:space="preserve">Download the file called: </w:t>
-      </w:r>
-      <w:r>
-        <w:rPr>
-          <w:b/>
-          <w:lang w:val="en-US"/>
-        </w:rPr>
-        <w:t>easyROB_win.zip</w:t>
-      </w:r>
+          <w:lang w:val="en-US"/>
+        </w:rPr>
+      </w:pPr>
     </w:p>
     <w:p>
       <w:pPr>
@@ -5367,10 +5463,21 @@
         <w:ind w:left="0"/>
         <w:jc w:val="both"/>
         <w:rPr>
-          <w:b/>
-          <w:lang w:val="en-US"/>
-        </w:rPr>
-      </w:pPr>
+          <w:lang w:val="en-US"/>
+        </w:rPr>
+      </w:pPr>
+      <w:r>
+        <w:rPr>
+          <w:lang w:val="en-US"/>
+        </w:rPr>
+        <w:t xml:space="preserve">7.3.2. </w:t>
+      </w:r>
+      <w:r>
+        <w:rPr>
+          <w:lang w:val="en-US"/>
+        </w:rPr>
+        <w:t>Activate the conda environment where ROBERT is installed:</w:t>
+      </w:r>
     </w:p>
     <w:p>
       <w:pPr>
@@ -5378,489 +5485,6 @@
         <w:ind w:left="0"/>
         <w:jc w:val="both"/>
         <w:rPr>
-          <w:b/>
-          <w:lang w:val="en-US"/>
-        </w:rPr>
-      </w:pPr>
-      <w:r>
-        <w:rPr>
-          <w:bCs/>
-          <w:lang w:val="en-US"/>
-        </w:rPr>
-        <w:t xml:space="preserve">7.1B.3. </w:t>
-      </w:r>
-      <w:r>
-        <w:rPr>
-          <w:lang w:val="en-US"/>
-        </w:rPr>
-        <w:t>Once downloaded, right-click the ZIP file and select “Extract All…”. Choose a simple location (for example, the Desktop).</w:t>
-      </w:r>
-    </w:p>
-    <w:p>
-      <w:pPr>
-        <w:pStyle w:val="ListParagraph"/>
-        <w:ind w:left="0"/>
-        <w:jc w:val="both"/>
-        <w:rPr>
-          <w:lang w:val="en-US"/>
-        </w:rPr>
-      </w:pPr>
-    </w:p>
-    <w:p>
-      <w:pPr>
-        <w:pStyle w:val="ListParagraph"/>
-        <w:ind w:left="0"/>
-        <w:jc w:val="both"/>
-        <w:rPr>
-          <w:b/>
-          <w:lang w:val="en-US"/>
-        </w:rPr>
-      </w:pPr>
-      <w:r>
-        <w:rPr>
-          <w:bCs/>
-          <w:lang w:val="en-US"/>
-        </w:rPr>
-        <w:t xml:space="preserve">7.1B.4. </w:t>
-      </w:r>
-      <w:r>
-        <w:rPr>
-          <w:lang w:val="en-US"/>
-        </w:rPr>
-        <w:t xml:space="preserve">Open the extracted folder and double-click </w:t>
-      </w:r>
-      <w:r>
-        <w:rPr>
-          <w:b/>
-          <w:lang w:val="en-US"/>
-        </w:rPr>
-        <w:t>launcher.vbs</w:t>
-      </w:r>
-      <w:r>
-        <w:rPr>
-          <w:lang w:val="en-US"/>
-        </w:rPr>
-        <w:t>. The program will start automatically</w:t>
-      </w:r>
-    </w:p>
-    <w:p>
-      <w:pPr>
-        <w:pStyle w:val="ListParagraph"/>
-        <w:ind w:left="0"/>
-        <w:jc w:val="both"/>
-        <w:rPr>
-          <w:b/>
-          <w:lang w:val="en-US"/>
-        </w:rPr>
-      </w:pPr>
-    </w:p>
-    <w:p>
-      <w:pPr>
-        <w:pStyle w:val="ListParagraph"/>
-        <w:ind w:left="0"/>
-        <w:jc w:val="both"/>
-        <w:rPr>
-          <w:b/>
-          <w:lang w:val="en-US"/>
-        </w:rPr>
-      </w:pPr>
-    </w:p>
-    <w:p>
-      <w:pPr>
-        <w:jc w:val="both"/>
-        <w:rPr>
-          <w:lang w:val="en-US"/>
-        </w:rPr>
-      </w:pPr>
-      <w:r>
-        <w:rPr>
-          <w:b/>
-          <w:color w:val="C00000"/>
-          <w:lang w:val="en-US"/>
-        </w:rPr>
-        <w:t>Fallback Method</w:t>
-      </w:r>
-      <w:r>
-        <w:rPr>
-          <w:b/>
-          <w:color w:val="C00000"/>
-          <w:lang w:val="en-US"/>
-        </w:rPr>
-        <w:t>!</w:t>
-      </w:r>
-      <w:r>
-        <w:rPr>
-          <w:color w:val="C00000"/>
-          <w:lang w:val="en-US"/>
-        </w:rPr>
-        <w:t xml:space="preserve"> </w:t>
-      </w:r>
-      <w:r>
-        <w:rPr>
-          <w:lang w:val="en-US"/>
-        </w:rPr>
-        <w:t>(If the Portable Version Does Not Start)</w:t>
-      </w:r>
-    </w:p>
-    <w:p>
-      <w:pPr>
-        <w:jc w:val="both"/>
-        <w:rPr>
-          <w:lang w:val="en-US"/>
-        </w:rPr>
-      </w:pPr>
-      <w:r>
-        <w:rPr>
-          <w:lang w:val="en-US"/>
-        </w:rPr>
-        <w:t>If the portable version does not launch correctly (for example, nothing happens, the window closes immediately, or you see environment/Qt errors), you can run easyROB using the standard Terminal method.</w:t>
-      </w:r>
-    </w:p>
-    <w:p>
-      <w:pPr>
-        <w:jc w:val="both"/>
-        <w:rPr>
-          <w:lang w:val="en-US"/>
-        </w:rPr>
-      </w:pPr>
-      <w:r>
-        <w:rPr>
-          <w:lang w:val="en-US"/>
-        </w:rPr>
-        <w:t>Please follow the instruc</w:t>
-      </w:r>
-      <w:r>
-        <w:rPr>
-          <w:lang w:val="en-US"/>
-        </w:rPr>
-        <w:t>tions described in Section 7.3.</w:t>
-      </w:r>
-    </w:p>
-    <w:p>
-      <w:pPr>
-        <w:jc w:val="both"/>
-        <w:rPr>
-          <w:lang w:val="en-US"/>
-        </w:rPr>
-      </w:pPr>
-      <w:r>
-        <w:rPr>
-          <w:lang w:val="en-US"/>
-        </w:rPr>
-        <w:t xml:space="preserve">If this situation occurs, </w:t>
-      </w:r>
-      <w:r>
-        <w:rPr>
-          <w:lang w:val="en-US"/>
-        </w:rPr>
-        <w:t>please let us know and include:</w:t>
-      </w:r>
-    </w:p>
-    <w:p>
-      <w:pPr>
-        <w:pStyle w:val="ListParagraph"/>
-        <w:numPr>
-          <w:ilvl w:val="0"/>
-          <w:numId w:val="41"/>
-        </w:numPr>
-        <w:ind w:left="900" w:firstLine="0"/>
-        <w:jc w:val="both"/>
-        <w:rPr>
-          <w:lang w:val="en-US"/>
-        </w:rPr>
-      </w:pPr>
-      <w:r>
-        <w:rPr>
-          <w:lang w:val="en-US"/>
-        </w:rPr>
-        <w:t>Your operating system and version</w:t>
-      </w:r>
-    </w:p>
-    <w:p>
-      <w:pPr>
-        <w:pStyle w:val="ListParagraph"/>
-        <w:numPr>
-          <w:ilvl w:val="0"/>
-          <w:numId w:val="41"/>
-        </w:numPr>
-        <w:ind w:left="900" w:firstLine="0"/>
-        <w:jc w:val="both"/>
-        <w:rPr>
-          <w:lang w:val="en-US"/>
-        </w:rPr>
-      </w:pPr>
-      <w:r>
-        <w:rPr>
-          <w:lang w:val="en-US"/>
-        </w:rPr>
-        <w:t>A brief description of what happens</w:t>
-      </w:r>
-    </w:p>
-    <w:p>
-      <w:pPr>
-        <w:pStyle w:val="ListParagraph"/>
-        <w:numPr>
-          <w:ilvl w:val="0"/>
-          <w:numId w:val="41"/>
-        </w:numPr>
-        <w:ind w:left="900" w:firstLine="0"/>
-        <w:jc w:val="both"/>
-        <w:rPr>
-          <w:lang w:val="en-US"/>
-        </w:rPr>
-      </w:pPr>
-      <w:r>
-        <w:rPr>
-          <w:lang w:val="en-US"/>
-        </w:rPr>
-        <w:t>Any error message shown</w:t>
-      </w:r>
-    </w:p>
-    <w:p>
-      <w:pPr>
-        <w:pStyle w:val="ListParagraph"/>
-        <w:numPr>
-          <w:ilvl w:val="0"/>
-          <w:numId w:val="41"/>
-        </w:numPr>
-        <w:ind w:left="900" w:firstLine="0"/>
-        <w:jc w:val="both"/>
-        <w:rPr>
-          <w:lang w:val="en-US"/>
-        </w:rPr>
-      </w:pPr>
-      <w:r>
-        <w:rPr>
-          <w:lang w:val="en-US"/>
-        </w:rPr>
-        <w:t xml:space="preserve">The file </w:t>
-      </w:r>
-      <w:r>
-        <w:rPr>
-          <w:b/>
-          <w:lang w:val="en-US"/>
-        </w:rPr>
-        <w:t>easyrob_process.log</w:t>
-      </w:r>
-      <w:r>
-        <w:rPr>
-          <w:lang w:val="en-US"/>
-        </w:rPr>
-        <w:t xml:space="preserve"> generated in the folder</w:t>
-      </w:r>
-    </w:p>
-    <w:p>
-      <w:pPr>
-        <w:jc w:val="both"/>
-        <w:rPr>
-          <w:lang w:val="en-US"/>
-        </w:rPr>
-      </w:pPr>
-    </w:p>
-    <w:p>
-      <w:pPr>
-        <w:pStyle w:val="Heading2"/>
-        <w:ind w:firstLine="0"/>
-        <w:jc w:val="both"/>
-        <w:rPr>
-          <w:lang w:val="en-US"/>
-        </w:rPr>
-      </w:pPr>
-      <w:r>
-        <w:rPr>
-          <w:lang w:val="en-US"/>
-        </w:rPr>
-        <w:t>7.2</w:t>
-      </w:r>
-      <w:r>
-        <w:rPr>
-          <w:lang w:val="en-US"/>
-        </w:rPr>
-        <w:t xml:space="preserve">. </w:t>
-      </w:r>
-      <w:r>
-        <w:rPr>
-          <w:lang w:val="en-US"/>
-        </w:rPr>
-        <w:t>Portable Version (Linux)</w:t>
-      </w:r>
-    </w:p>
-    <w:p>
-      <w:pPr>
-        <w:pStyle w:val="ListParagraph"/>
-        <w:ind w:left="0"/>
-        <w:jc w:val="both"/>
-        <w:rPr>
-          <w:lang w:val="en-US"/>
-        </w:rPr>
-      </w:pPr>
-    </w:p>
-    <w:p>
-      <w:pPr>
-        <w:pStyle w:val="ListParagraph"/>
-        <w:ind w:left="0"/>
-        <w:jc w:val="both"/>
-        <w:rPr>
-          <w:lang w:val="en-US"/>
-        </w:rPr>
-      </w:pPr>
-      <w:r>
-        <w:rPr>
-          <w:bCs/>
-          <w:lang w:val="en-US"/>
-        </w:rPr>
-        <w:t xml:space="preserve">7.2.1. </w:t>
-      </w:r>
-      <w:r>
-        <w:rPr>
-          <w:bCs/>
-          <w:lang w:val="en-US"/>
-        </w:rPr>
-        <w:t>Go to the Releases page and scroll down to the “Assets” section.</w:t>
-      </w:r>
-    </w:p>
-    <w:p>
-      <w:pPr>
-        <w:pStyle w:val="ListParagraph"/>
-        <w:ind w:left="0"/>
-        <w:jc w:val="both"/>
-        <w:rPr>
-          <w:lang w:val="en-US"/>
-        </w:rPr>
-      </w:pPr>
-      <w:hyperlink r:id="rId21" w:history="1">
-        <w:r>
-          <w:rPr>
-            <w:rStyle w:val="Hyperlink"/>
-            <w:lang w:val="en-US"/>
-          </w:rPr>
-          <w:t>https://github.com/MiguelMartzFdez/easyROB/releases</w:t>
-        </w:r>
-      </w:hyperlink>
-    </w:p>
-    <w:p>
-      <w:pPr>
-        <w:pStyle w:val="ListParagraph"/>
-        <w:ind w:left="0"/>
-        <w:jc w:val="both"/>
-        <w:rPr>
-          <w:lang w:val="en-US"/>
-        </w:rPr>
-      </w:pPr>
-    </w:p>
-    <w:p>
-      <w:pPr>
-        <w:pStyle w:val="ListParagraph"/>
-        <w:ind w:left="0"/>
-        <w:jc w:val="both"/>
-        <w:rPr>
-          <w:lang w:val="en-US"/>
-        </w:rPr>
-      </w:pPr>
-      <w:r>
-        <w:rPr>
-          <w:bCs/>
-          <w:lang w:val="en-US"/>
-        </w:rPr>
-        <w:t xml:space="preserve">7.2.2. </w:t>
-      </w:r>
-      <w:r>
-        <w:rPr>
-          <w:lang w:val="en-US"/>
-        </w:rPr>
-        <w:t xml:space="preserve">Download the file called: </w:t>
-      </w:r>
-      <w:r>
-        <w:rPr>
-          <w:b/>
-          <w:lang w:val="en-US"/>
-        </w:rPr>
-        <w:t>easyROB_linux.zip</w:t>
-      </w:r>
-    </w:p>
-    <w:p>
-      <w:pPr>
-        <w:pStyle w:val="ListParagraph"/>
-        <w:ind w:left="0"/>
-        <w:jc w:val="both"/>
-        <w:rPr>
-          <w:lang w:val="en-US"/>
-        </w:rPr>
-      </w:pPr>
-    </w:p>
-    <w:p>
-      <w:pPr>
-        <w:pStyle w:val="ListParagraph"/>
-        <w:ind w:left="0"/>
-        <w:jc w:val="both"/>
-        <w:rPr>
-          <w:b/>
-          <w:lang w:val="en-US"/>
-        </w:rPr>
-      </w:pPr>
-      <w:r>
-        <w:rPr>
-          <w:bCs/>
-          <w:lang w:val="en-US"/>
-        </w:rPr>
-        <w:t xml:space="preserve">7.2.3. </w:t>
-      </w:r>
-      <w:r>
-        <w:rPr>
-          <w:lang w:val="en-US"/>
-        </w:rPr>
-        <w:t>Once downloaded, right-click the ZIP file and select “Extract All…”. Choose a simple location (for example, the Desktop).</w:t>
-      </w:r>
-    </w:p>
-    <w:p>
-      <w:pPr>
-        <w:pStyle w:val="ListParagraph"/>
-        <w:ind w:left="0"/>
-        <w:jc w:val="both"/>
-        <w:rPr>
-          <w:lang w:val="en-US"/>
-        </w:rPr>
-      </w:pPr>
-    </w:p>
-    <w:p>
-      <w:pPr>
-        <w:pStyle w:val="ListParagraph"/>
-        <w:ind w:left="0"/>
-        <w:jc w:val="both"/>
-        <w:rPr>
-          <w:b/>
-          <w:lang w:val="en-US"/>
-        </w:rPr>
-      </w:pPr>
-      <w:r>
-        <w:rPr>
-          <w:bCs/>
-          <w:lang w:val="en-US"/>
-        </w:rPr>
-        <w:t xml:space="preserve">7.2.4. </w:t>
-      </w:r>
-      <w:r>
-        <w:rPr>
-          <w:b/>
-          <w:lang w:val="en-US"/>
-        </w:rPr>
-        <w:t>First-time setup only</w:t>
-      </w:r>
-      <w:r>
-        <w:rPr>
-          <w:lang w:val="en-US"/>
-        </w:rPr>
-        <w:t>: right-click inside the folder (in an empty area), select “Open in Terminal”, and run:</w:t>
-      </w:r>
-    </w:p>
-    <w:p>
-      <w:pPr>
-        <w:pStyle w:val="ListParagraph"/>
-        <w:ind w:left="0"/>
-        <w:jc w:val="both"/>
-        <w:rPr>
-          <w:rFonts w:ascii="Courier New" w:eastAsia="Courier New" w:hAnsi="Courier New"/>
-          <w:sz w:val="20"/>
           <w:lang w:val="en-US"/>
         </w:rPr>
       </w:pPr>
@@ -5872,7 +5496,6 @@
         <w:ind w:left="0"/>
         <w:jc w:val="both"/>
         <w:rPr>
-          <w:b/>
           <w:lang w:val="en-US"/>
         </w:rPr>
       </w:pPr>
@@ -5882,8 +5505,15 @@
           <w:sz w:val="20"/>
           <w:lang w:val="en-US"/>
         </w:rPr>
-        <w:lastRenderedPageBreak/>
-        <w:t>chmod +x run_easyrob.sh</w:t>
+        <w:t xml:space="preserve">conda activate </w:t>
+      </w:r>
+      <w:r>
+        <w:rPr>
+          <w:rFonts w:ascii="Courier New" w:eastAsia="Courier New" w:hAnsi="Courier New"/>
+          <w:sz w:val="20"/>
+          <w:lang w:val="en-US"/>
+        </w:rPr>
+        <w:t>cheminf</w:t>
       </w:r>
     </w:p>
     <w:p>
@@ -5907,16 +5537,21 @@
       </w:pPr>
       <w:r>
         <w:rPr>
-          <w:bCs/>
-          <w:lang w:val="en-US"/>
-        </w:rPr>
-        <w:t xml:space="preserve">7.2.5. </w:t>
-      </w:r>
-      <w:r>
-        <w:rPr>
-          <w:lang w:val="en-US"/>
-        </w:rPr>
-        <w:t>In the same Terminal window, run:</w:t>
+          <w:lang w:val="en-US"/>
+        </w:rPr>
+        <w:t xml:space="preserve">7.3.3. </w:t>
+      </w:r>
+      <w:r>
+        <w:rPr>
+          <w:lang w:val="en-US"/>
+        </w:rPr>
+        <w:t>Run easyrob</w:t>
+      </w:r>
+      <w:r>
+        <w:rPr>
+          <w:lang w:val="en-US"/>
+        </w:rPr>
+        <w:t>:</w:t>
       </w:r>
     </w:p>
     <w:p>
@@ -5936,18 +5571,16 @@
         <w:ind w:left="0"/>
         <w:jc w:val="both"/>
         <w:rPr>
+          <w:lang w:val="en-US"/>
+        </w:rPr>
+      </w:pPr>
+      <w:r>
+        <w:rPr>
           <w:rFonts w:ascii="Courier New" w:eastAsia="Courier New" w:hAnsi="Courier New"/>
           <w:sz w:val="20"/>
           <w:lang w:val="en-US"/>
         </w:rPr>
-      </w:pPr>
-      <w:r>
-        <w:rPr>
-          <w:rFonts w:ascii="Courier New" w:eastAsia="Courier New" w:hAnsi="Courier New"/>
-          <w:sz w:val="20"/>
-          <w:lang w:val="en-US"/>
-        </w:rPr>
-        <w:t>./run_easyrob.sh</w:t>
+        <w:t>easyrob</w:t>
       </w:r>
     </w:p>
     <w:p>
@@ -5959,838 +5592,6 @@
           <w:lang w:val="en-US"/>
         </w:rPr>
       </w:pPr>
-    </w:p>
-    <w:p>
-      <w:pPr>
-        <w:jc w:val="both"/>
-        <w:rPr>
-          <w:lang w:val="en-US"/>
-        </w:rPr>
-      </w:pPr>
-      <w:r>
-        <w:rPr>
-          <w:b/>
-          <w:color w:val="C00000"/>
-          <w:lang w:val="en-US"/>
-        </w:rPr>
-        <w:t>Fallback Method!</w:t>
-      </w:r>
-      <w:r>
-        <w:rPr>
-          <w:color w:val="C00000"/>
-          <w:lang w:val="en-US"/>
-        </w:rPr>
-        <w:t xml:space="preserve"> </w:t>
-      </w:r>
-      <w:r>
-        <w:rPr>
-          <w:lang w:val="en-US"/>
-        </w:rPr>
-        <w:t>(If the Portable Version Does Not Start)</w:t>
-      </w:r>
-    </w:p>
-    <w:p>
-      <w:pPr>
-        <w:jc w:val="both"/>
-        <w:rPr>
-          <w:lang w:val="en-US"/>
-        </w:rPr>
-      </w:pPr>
-      <w:r>
-        <w:rPr>
-          <w:lang w:val="en-US"/>
-        </w:rPr>
-        <w:t xml:space="preserve">If the portable version does not launch correctly (for example, nothing happens, the window closes immediately, or you see environment/Qt errors), you can run easyROB using the standard Terminal method. </w:t>
-      </w:r>
-    </w:p>
-    <w:p>
-      <w:pPr>
-        <w:jc w:val="both"/>
-        <w:rPr>
-          <w:lang w:val="en-US"/>
-        </w:rPr>
-      </w:pPr>
-      <w:r>
-        <w:rPr>
-          <w:lang w:val="en-US"/>
-        </w:rPr>
-        <w:t>Please follow the instructions described in Section 7.3.</w:t>
-      </w:r>
-    </w:p>
-    <w:p>
-      <w:pPr>
-        <w:jc w:val="both"/>
-        <w:rPr>
-          <w:lang w:val="en-US"/>
-        </w:rPr>
-      </w:pPr>
-      <w:r>
-        <w:rPr>
-          <w:lang w:val="en-US"/>
-        </w:rPr>
-        <w:t>If this situation occurs, please let us know and include:</w:t>
-      </w:r>
-    </w:p>
-    <w:p>
-      <w:pPr>
-        <w:pStyle w:val="ListParagraph"/>
-        <w:numPr>
-          <w:ilvl w:val="0"/>
-          <w:numId w:val="41"/>
-        </w:numPr>
-        <w:ind w:left="900" w:firstLine="0"/>
-        <w:jc w:val="both"/>
-        <w:rPr>
-          <w:lang w:val="en-US"/>
-        </w:rPr>
-      </w:pPr>
-      <w:r>
-        <w:rPr>
-          <w:lang w:val="en-US"/>
-        </w:rPr>
-        <w:t>Your operating system and version</w:t>
-      </w:r>
-    </w:p>
-    <w:p>
-      <w:pPr>
-        <w:pStyle w:val="ListParagraph"/>
-        <w:numPr>
-          <w:ilvl w:val="0"/>
-          <w:numId w:val="41"/>
-        </w:numPr>
-        <w:ind w:left="900" w:firstLine="0"/>
-        <w:jc w:val="both"/>
-        <w:rPr>
-          <w:lang w:val="en-US"/>
-        </w:rPr>
-      </w:pPr>
-      <w:r>
-        <w:rPr>
-          <w:lang w:val="en-US"/>
-        </w:rPr>
-        <w:t>A brief description of what happens</w:t>
-      </w:r>
-    </w:p>
-    <w:p>
-      <w:pPr>
-        <w:pStyle w:val="ListParagraph"/>
-        <w:numPr>
-          <w:ilvl w:val="0"/>
-          <w:numId w:val="41"/>
-        </w:numPr>
-        <w:ind w:left="900" w:firstLine="0"/>
-        <w:jc w:val="both"/>
-        <w:rPr>
-          <w:lang w:val="en-US"/>
-        </w:rPr>
-      </w:pPr>
-      <w:r>
-        <w:rPr>
-          <w:lang w:val="en-US"/>
-        </w:rPr>
-        <w:t>Any error message shown</w:t>
-      </w:r>
-    </w:p>
-    <w:p>
-      <w:pPr>
-        <w:pStyle w:val="ListParagraph"/>
-        <w:numPr>
-          <w:ilvl w:val="0"/>
-          <w:numId w:val="41"/>
-        </w:numPr>
-        <w:ind w:left="900" w:firstLine="0"/>
-        <w:jc w:val="both"/>
-        <w:rPr>
-          <w:lang w:val="en-US"/>
-        </w:rPr>
-      </w:pPr>
-      <w:r>
-        <w:rPr>
-          <w:lang w:val="en-US"/>
-        </w:rPr>
-        <w:t xml:space="preserve">The file </w:t>
-      </w:r>
-      <w:r>
-        <w:rPr>
-          <w:b/>
-          <w:lang w:val="en-US"/>
-        </w:rPr>
-        <w:t xml:space="preserve">easyrob_process.log </w:t>
-      </w:r>
-      <w:r>
-        <w:rPr>
-          <w:lang w:val="en-US"/>
-        </w:rPr>
-        <w:t>generated in the folder</w:t>
-      </w:r>
-    </w:p>
-    <w:p>
-      <w:pPr>
-        <w:jc w:val="both"/>
-        <w:rPr>
-          <w:lang w:val="en-US"/>
-        </w:rPr>
-      </w:pPr>
-    </w:p>
-    <w:p>
-      <w:pPr>
-        <w:pStyle w:val="Heading2"/>
-        <w:ind w:firstLine="0"/>
-        <w:jc w:val="both"/>
-        <w:rPr>
-          <w:lang w:val="en-US"/>
-        </w:rPr>
-      </w:pPr>
-      <w:r>
-        <w:rPr>
-          <w:lang w:val="en-US"/>
-        </w:rPr>
-        <w:t>7.3</w:t>
-      </w:r>
-      <w:r>
-        <w:rPr>
-          <w:lang w:val="en-US"/>
-        </w:rPr>
-        <w:t>.</w:t>
-      </w:r>
-      <w:r>
-        <w:rPr>
-          <w:lang w:val="en-US"/>
-        </w:rPr>
-        <w:t xml:space="preserve"> Testing easyROB from Terminal (macOS / Fallback Method)</w:t>
-      </w:r>
-    </w:p>
-    <w:p>
-      <w:pPr>
-        <w:jc w:val="both"/>
-        <w:rPr>
-          <w:lang w:val="en-US"/>
-        </w:rPr>
-      </w:pPr>
-      <w:r>
-        <w:rPr>
-          <w:lang w:val="en-US"/>
-        </w:rPr>
-        <w:t>This method runs easyROB using a standard ROBERT installation (non-portable).</w:t>
-      </w:r>
-    </w:p>
-    <w:p>
-      <w:pPr>
-        <w:pStyle w:val="Heading3"/>
-        <w:jc w:val="both"/>
-        <w:rPr>
-          <w:b/>
-          <w:lang w:val="en-US"/>
-        </w:rPr>
-      </w:pPr>
-      <w:r>
-        <w:rPr>
-          <w:b/>
-          <w:lang w:val="en-US"/>
-        </w:rPr>
-        <w:t>Steps</w:t>
-      </w:r>
-    </w:p>
-    <w:p>
-      <w:pPr>
-        <w:jc w:val="both"/>
-        <w:rPr>
-          <w:lang w:val="en-US"/>
-        </w:rPr>
-      </w:pPr>
-    </w:p>
-    <w:p>
-      <w:pPr>
-        <w:pStyle w:val="ListParagraph"/>
-        <w:ind w:left="0"/>
-        <w:jc w:val="both"/>
-        <w:rPr>
-          <w:lang w:val="en-US"/>
-        </w:rPr>
-      </w:pPr>
-      <w:r>
-        <w:rPr>
-          <w:lang w:val="en-US"/>
-        </w:rPr>
-        <w:t xml:space="preserve">7.3.1. </w:t>
-      </w:r>
-      <w:r>
-        <w:rPr>
-          <w:lang w:val="en-US"/>
-        </w:rPr>
-        <w:t xml:space="preserve">Open a </w:t>
-      </w:r>
-      <w:r>
-        <w:rPr>
-          <w:lang w:val="en-US"/>
-        </w:rPr>
-        <w:t>Terminal.</w:t>
-      </w:r>
-    </w:p>
-    <w:p>
-      <w:pPr>
-        <w:pStyle w:val="ListParagraph"/>
-        <w:ind w:left="0"/>
-        <w:jc w:val="both"/>
-        <w:rPr>
-          <w:lang w:val="en-US"/>
-        </w:rPr>
-      </w:pPr>
-    </w:p>
-    <w:p>
-      <w:pPr>
-        <w:pStyle w:val="ListParagraph"/>
-        <w:ind w:left="0"/>
-        <w:jc w:val="both"/>
-        <w:rPr>
-          <w:lang w:val="en-US"/>
-        </w:rPr>
-      </w:pPr>
-      <w:r>
-        <w:rPr>
-          <w:b/>
-          <w:lang w:val="en-US"/>
-        </w:rPr>
-        <w:t>Windows</w:t>
-      </w:r>
-      <w:r>
-        <w:rPr>
-          <w:lang w:val="en-US"/>
-        </w:rPr>
-        <w:t>:</w:t>
-      </w:r>
-    </w:p>
-    <w:p>
-      <w:pPr>
-        <w:pStyle w:val="ListParagraph"/>
-        <w:ind w:left="0"/>
-        <w:jc w:val="both"/>
-        <w:rPr>
-          <w:lang w:val="en-US"/>
-        </w:rPr>
-      </w:pPr>
-      <w:r>
-        <w:rPr>
-          <w:lang w:val="en-US"/>
-        </w:rPr>
-        <w:t xml:space="preserve">Open </w:t>
-      </w:r>
-      <w:r>
-        <w:rPr>
-          <w:rStyle w:val="Strong"/>
-          <w:lang w:val="en-US"/>
-        </w:rPr>
-        <w:t>Anaconda Prompt</w:t>
-      </w:r>
-      <w:r>
-        <w:rPr>
-          <w:lang w:val="en-US"/>
-        </w:rPr>
-        <w:t xml:space="preserve"> (do not use the standard Windows Command Prompt).</w:t>
-      </w:r>
-    </w:p>
-    <w:p>
-      <w:pPr>
-        <w:pStyle w:val="ListParagraph"/>
-        <w:ind w:left="0"/>
-        <w:jc w:val="both"/>
-        <w:rPr>
-          <w:lang w:val="en-US"/>
-        </w:rPr>
-      </w:pPr>
-    </w:p>
-    <w:p>
-      <w:pPr>
-        <w:pStyle w:val="ListParagraph"/>
-        <w:ind w:left="0"/>
-        <w:jc w:val="both"/>
-        <w:rPr>
-          <w:lang w:val="en-US"/>
-        </w:rPr>
-      </w:pPr>
-      <w:r>
-        <w:rPr>
-          <w:b/>
-          <w:lang w:val="en-US"/>
-        </w:rPr>
-        <w:t>macOS</w:t>
-      </w:r>
-      <w:r>
-        <w:rPr>
-          <w:lang w:val="en-US"/>
-        </w:rPr>
-        <w:t>:</w:t>
-      </w:r>
-    </w:p>
-    <w:p>
-      <w:pPr>
-        <w:pStyle w:val="ListParagraph"/>
-        <w:ind w:left="0"/>
-        <w:jc w:val="both"/>
-        <w:rPr>
-          <w:lang w:val="en-US"/>
-        </w:rPr>
-      </w:pPr>
-      <w:r>
-        <w:rPr>
-          <w:lang w:val="en-US"/>
-        </w:rPr>
-        <w:t>Press Cmd + Space, type Terminal, and press Enter.</w:t>
-      </w:r>
-    </w:p>
-    <w:p>
-      <w:pPr>
-        <w:pStyle w:val="ListParagraph"/>
-        <w:ind w:left="0"/>
-        <w:jc w:val="both"/>
-        <w:rPr>
-          <w:lang w:val="en-US"/>
-        </w:rPr>
-      </w:pPr>
-    </w:p>
-    <w:p>
-      <w:pPr>
-        <w:pStyle w:val="ListParagraph"/>
-        <w:ind w:left="0"/>
-        <w:jc w:val="both"/>
-        <w:rPr>
-          <w:lang w:val="en-US"/>
-        </w:rPr>
-      </w:pPr>
-      <w:r>
-        <w:rPr>
-          <w:b/>
-          <w:lang w:val="en-US"/>
-        </w:rPr>
-        <w:t>Linux</w:t>
-      </w:r>
-      <w:r>
-        <w:rPr>
-          <w:lang w:val="en-US"/>
-        </w:rPr>
-        <w:t>:</w:t>
-      </w:r>
-    </w:p>
-    <w:p>
-      <w:pPr>
-        <w:pStyle w:val="ListParagraph"/>
-        <w:ind w:left="0"/>
-        <w:jc w:val="both"/>
-        <w:rPr>
-          <w:lang w:val="en-US"/>
-        </w:rPr>
-      </w:pPr>
-      <w:r>
-        <w:rPr>
-          <w:lang w:val="en-US"/>
-        </w:rPr>
-        <w:t>Press Ctrl + Alt + T or search for “Terminal” in your applications menu</w:t>
-      </w:r>
-    </w:p>
-    <w:p>
-      <w:pPr>
-        <w:pStyle w:val="ListParagraph"/>
-        <w:ind w:left="0"/>
-        <w:jc w:val="both"/>
-        <w:rPr>
-          <w:lang w:val="en-US"/>
-        </w:rPr>
-      </w:pPr>
-    </w:p>
-    <w:p>
-      <w:pPr>
-        <w:pStyle w:val="ListParagraph"/>
-        <w:ind w:left="0"/>
-        <w:jc w:val="both"/>
-        <w:rPr>
-          <w:lang w:val="en-US"/>
-        </w:rPr>
-      </w:pPr>
-      <w:r>
-        <w:rPr>
-          <w:lang w:val="en-US"/>
-        </w:rPr>
-        <w:t xml:space="preserve">7.3.2. </w:t>
-      </w:r>
-      <w:r>
-        <w:rPr>
-          <w:lang w:val="en-US"/>
-        </w:rPr>
-        <w:t>Activate the conda environment where ROBERT is installed:</w:t>
-      </w:r>
-    </w:p>
-    <w:p>
-      <w:pPr>
-        <w:pStyle w:val="ListParagraph"/>
-        <w:ind w:left="0"/>
-        <w:jc w:val="both"/>
-        <w:rPr>
-          <w:lang w:val="en-US"/>
-        </w:rPr>
-      </w:pPr>
-    </w:p>
-    <w:p>
-      <w:pPr>
-        <w:pStyle w:val="ListParagraph"/>
-        <w:shd w:val="clear" w:color="auto" w:fill="E8E8E8" w:themeFill="background2"/>
-        <w:ind w:left="0"/>
-        <w:jc w:val="both"/>
-        <w:rPr>
-          <w:lang w:val="en-US"/>
-        </w:rPr>
-      </w:pPr>
-      <w:r>
-        <w:rPr>
-          <w:rFonts w:ascii="Courier New" w:eastAsia="Courier New" w:hAnsi="Courier New"/>
-          <w:sz w:val="20"/>
-          <w:lang w:val="en-US"/>
-        </w:rPr>
-        <w:t xml:space="preserve">conda activate </w:t>
-      </w:r>
-      <w:r>
-        <w:rPr>
-          <w:rFonts w:ascii="Courier New" w:eastAsia="Courier New" w:hAnsi="Courier New"/>
-          <w:sz w:val="20"/>
-          <w:lang w:val="en-US"/>
-        </w:rPr>
-        <w:t>cheminf</w:t>
-      </w:r>
-    </w:p>
-    <w:p>
-      <w:pPr>
-        <w:pStyle w:val="ListParagraph"/>
-        <w:ind w:left="0"/>
-        <w:jc w:val="both"/>
-        <w:rPr>
-          <w:lang w:val="en-US"/>
-        </w:rPr>
-      </w:pPr>
-    </w:p>
-    <w:p>
-      <w:pPr>
-        <w:pStyle w:val="ListParagraph"/>
-        <w:ind w:left="0"/>
-        <w:jc w:val="both"/>
-        <w:rPr>
-          <w:lang w:val="en-US"/>
-        </w:rPr>
-      </w:pPr>
-      <w:r>
-        <w:rPr>
-          <w:lang w:val="en-US"/>
-        </w:rPr>
-        <w:t xml:space="preserve">7.3.3. </w:t>
-      </w:r>
-      <w:r>
-        <w:rPr>
-          <w:lang w:val="en-US"/>
-        </w:rPr>
-        <w:t xml:space="preserve">Download </w:t>
-      </w:r>
-      <w:r>
-        <w:rPr>
-          <w:b/>
-          <w:lang w:val="en-US"/>
-        </w:rPr>
-        <w:t>easyrob.py</w:t>
-      </w:r>
-      <w:r>
-        <w:rPr>
-          <w:lang w:val="en-US"/>
-        </w:rPr>
-        <w:t xml:space="preserve"> from:</w:t>
-      </w:r>
-    </w:p>
-    <w:p>
-      <w:pPr>
-        <w:pStyle w:val="ListParagraph"/>
-        <w:ind w:left="0"/>
-        <w:jc w:val="both"/>
-        <w:rPr>
-          <w:lang w:val="en-US"/>
-        </w:rPr>
-      </w:pPr>
-    </w:p>
-    <w:p>
-      <w:pPr>
-        <w:pStyle w:val="ListParagraph"/>
-        <w:ind w:left="0"/>
-        <w:jc w:val="both"/>
-        <w:rPr>
-          <w:lang w:val="en-US"/>
-        </w:rPr>
-      </w:pPr>
-      <w:hyperlink r:id="rId22" w:history="1">
-        <w:r>
-          <w:rPr>
-            <w:rStyle w:val="Hyperlink"/>
-            <w:lang w:val="en-US"/>
-          </w:rPr>
-          <w:t>https://github.com/jvalegre/robert/blob/master/GUI_easyROB/easyrob.py</w:t>
-        </w:r>
-      </w:hyperlink>
-    </w:p>
-    <w:p>
-      <w:pPr>
-        <w:pStyle w:val="ListParagraph"/>
-        <w:ind w:left="0"/>
-        <w:jc w:val="both"/>
-        <w:rPr>
-          <w:lang w:val="en-US"/>
-        </w:rPr>
-      </w:pPr>
-      <w:r>
-        <w:rPr>
-          <w:noProof/>
-          <w:lang w:val="en-US" w:eastAsia="es-ES"/>
-        </w:rPr>
-        <w:drawing>
-          <wp:anchor distT="0" distB="0" distL="114300" distR="114300" simplePos="0" relativeHeight="251658240" behindDoc="0" locked="0" layoutInCell="1" allowOverlap="1" wp14:anchorId="14D8A481" wp14:editId="025634CA">
-            <wp:simplePos x="0" y="0"/>
-            <wp:positionH relativeFrom="margin">
-              <wp:posOffset>4594225</wp:posOffset>
-            </wp:positionH>
-            <wp:positionV relativeFrom="paragraph">
-              <wp:posOffset>152083</wp:posOffset>
-            </wp:positionV>
-            <wp:extent cx="1017814" cy="243163"/>
-            <wp:effectExtent l="0" t="0" r="0" b="5080"/>
-            <wp:wrapNone/>
-            <wp:docPr id="1" name="Imagen 1" descr="download"/>
-            <wp:cNvGraphicFramePr>
-              <a:graphicFrameLocks xmlns:a="http://schemas.openxmlformats.org/drawingml/2006/main" noChangeAspect="1"/>
-            </wp:cNvGraphicFramePr>
-            <a:graphic xmlns:a="http://schemas.openxmlformats.org/drawingml/2006/main">
-              <a:graphicData uri="http://schemas.openxmlformats.org/drawingml/2006/picture">
-                <pic:pic xmlns:pic="http://schemas.openxmlformats.org/drawingml/2006/picture">
-                  <pic:nvPicPr>
-                    <pic:cNvPr id="0" name="Picture 1" descr="download"/>
-                    <pic:cNvPicPr>
-                      <a:picLocks noChangeAspect="1" noChangeArrowheads="1"/>
-                    </pic:cNvPicPr>
-                  </pic:nvPicPr>
-                  <pic:blipFill>
-                    <a:blip r:embed="rId23">
-                      <a:extLst>
-                        <a:ext uri="{28A0092B-C50C-407E-A947-70E740481C1C}">
-                          <a14:useLocalDpi xmlns:a14="http://schemas.microsoft.com/office/drawing/2010/main" val="0"/>
-                        </a:ext>
-                      </a:extLst>
-                    </a:blip>
-                    <a:srcRect/>
-                    <a:stretch>
-                      <a:fillRect/>
-                    </a:stretch>
-                  </pic:blipFill>
-                  <pic:spPr bwMode="auto">
-                    <a:xfrm>
-                      <a:off x="0" y="0"/>
-                      <a:ext cx="1017814" cy="243163"/>
-                    </a:xfrm>
-                    <a:prstGeom prst="rect">
-                      <a:avLst/>
-                    </a:prstGeom>
-                    <a:noFill/>
-                    <a:ln>
-                      <a:noFill/>
-                    </a:ln>
-                  </pic:spPr>
-                </pic:pic>
-              </a:graphicData>
-            </a:graphic>
-            <wp14:sizeRelH relativeFrom="margin">
-              <wp14:pctWidth>0</wp14:pctWidth>
-            </wp14:sizeRelH>
-            <wp14:sizeRelV relativeFrom="margin">
-              <wp14:pctHeight>0</wp14:pctHeight>
-            </wp14:sizeRelV>
-          </wp:anchor>
-        </w:drawing>
-      </w:r>
-    </w:p>
-    <w:p>
-      <w:pPr>
-        <w:pStyle w:val="ListParagraph"/>
-        <w:ind w:left="0"/>
-        <w:jc w:val="both"/>
-        <w:rPr>
-          <w:lang w:val="en-US"/>
-        </w:rPr>
-      </w:pPr>
-      <w:r>
-        <w:rPr>
-          <w:lang w:val="en-US"/>
-        </w:rPr>
-        <w:t>Click the 'Download raw file' button (top-right area of the page).</w:t>
-      </w:r>
-      <w:r>
-        <w:rPr>
-          <w:lang w:val="en-US"/>
-        </w:rPr>
-        <w:t xml:space="preserve"> </w:t>
-      </w:r>
-    </w:p>
-    <w:p>
-      <w:pPr>
-        <w:pStyle w:val="ListParagraph"/>
-        <w:ind w:left="0"/>
-        <w:jc w:val="both"/>
-        <w:rPr>
-          <w:lang w:val="en-US"/>
-        </w:rPr>
-      </w:pPr>
-    </w:p>
-    <w:p>
-      <w:pPr>
-        <w:pStyle w:val="ListParagraph"/>
-        <w:ind w:left="0"/>
-        <w:jc w:val="both"/>
-        <w:rPr>
-          <w:lang w:val="en-US"/>
-        </w:rPr>
-      </w:pPr>
-    </w:p>
-    <w:p>
-      <w:pPr>
-        <w:pStyle w:val="ListParagraph"/>
-        <w:ind w:left="0"/>
-        <w:jc w:val="both"/>
-        <w:rPr>
-          <w:lang w:val="en-US"/>
-        </w:rPr>
-      </w:pPr>
-      <w:r>
-        <w:rPr>
-          <w:lang w:val="en-US"/>
-        </w:rPr>
-        <w:t xml:space="preserve">7.3.4. </w:t>
-      </w:r>
-      <w:r>
-        <w:rPr>
-          <w:lang w:val="en-US"/>
-        </w:rPr>
-        <w:t>N</w:t>
-      </w:r>
-      <w:r>
-        <w:rPr>
-          <w:lang w:val="en-US"/>
-        </w:rPr>
-        <w:t>avigate to the folder where you saved the file:</w:t>
-      </w:r>
-    </w:p>
-    <w:p>
-      <w:pPr>
-        <w:pStyle w:val="ListParagraph"/>
-        <w:ind w:left="0"/>
-        <w:jc w:val="both"/>
-        <w:rPr>
-          <w:lang w:val="en-US"/>
-        </w:rPr>
-      </w:pPr>
-    </w:p>
-    <w:p>
-      <w:pPr>
-        <w:pStyle w:val="ListParagraph"/>
-        <w:shd w:val="clear" w:color="auto" w:fill="E8E8E8" w:themeFill="background2"/>
-        <w:ind w:left="0"/>
-        <w:jc w:val="both"/>
-        <w:rPr>
-          <w:rFonts w:ascii="Courier New" w:eastAsia="Courier New" w:hAnsi="Courier New"/>
-          <w:sz w:val="20"/>
-          <w:lang w:val="en-US"/>
-        </w:rPr>
-      </w:pPr>
-      <w:r>
-        <w:rPr>
-          <w:rFonts w:ascii="Courier New" w:eastAsia="Courier New" w:hAnsi="Courier New"/>
-          <w:sz w:val="20"/>
-          <w:lang w:val="en-US"/>
-        </w:rPr>
-        <w:t>cd /path/to/your/folder</w:t>
-      </w:r>
-    </w:p>
-    <w:p>
-      <w:pPr>
-        <w:pStyle w:val="ListParagraph"/>
-        <w:ind w:left="0"/>
-        <w:jc w:val="both"/>
-        <w:rPr>
-          <w:rFonts w:ascii="Courier New" w:eastAsia="Courier New" w:hAnsi="Courier New"/>
-          <w:sz w:val="20"/>
-          <w:lang w:val="en-US"/>
-        </w:rPr>
-      </w:pPr>
-    </w:p>
-    <w:p>
-      <w:pPr>
-        <w:pStyle w:val="ListParagraph"/>
-        <w:ind w:left="0"/>
-        <w:jc w:val="both"/>
-        <w:rPr>
-          <w:lang w:val="en-US"/>
-        </w:rPr>
-      </w:pPr>
-    </w:p>
-    <w:p>
-      <w:pPr>
-        <w:pStyle w:val="ListParagraph"/>
-        <w:ind w:left="0"/>
-        <w:jc w:val="both"/>
-        <w:rPr>
-          <w:lang w:val="en-US"/>
-        </w:rPr>
-      </w:pPr>
-      <w:r>
-        <w:rPr>
-          <w:lang w:val="en-US"/>
-        </w:rPr>
-        <w:t xml:space="preserve">7.3.5. </w:t>
-      </w:r>
-      <w:r>
-        <w:rPr>
-          <w:lang w:val="en-US"/>
-        </w:rPr>
-        <w:t>L</w:t>
-      </w:r>
-      <w:r>
-        <w:rPr>
-          <w:lang w:val="en-US"/>
-        </w:rPr>
-        <w:t>aunch easyROB by running:</w:t>
-      </w:r>
-    </w:p>
-    <w:p>
-      <w:pPr>
-        <w:pStyle w:val="ListParagraph"/>
-        <w:ind w:left="0"/>
-        <w:jc w:val="both"/>
-        <w:rPr>
-          <w:rFonts w:ascii="Courier New" w:eastAsia="Courier New" w:hAnsi="Courier New"/>
-          <w:sz w:val="20"/>
-          <w:lang w:val="en-US"/>
-        </w:rPr>
-      </w:pPr>
-    </w:p>
-    <w:p>
-      <w:pPr>
-        <w:pStyle w:val="ListParagraph"/>
-        <w:shd w:val="clear" w:color="auto" w:fill="E8E8E8" w:themeFill="background2"/>
-        <w:ind w:left="0"/>
-        <w:jc w:val="both"/>
-        <w:rPr>
-          <w:rFonts w:ascii="Courier New" w:eastAsia="Courier New" w:hAnsi="Courier New"/>
-          <w:sz w:val="20"/>
-          <w:lang w:val="en-US"/>
-        </w:rPr>
-      </w:pPr>
-      <w:r>
-        <w:rPr>
-          <w:rFonts w:ascii="Courier New" w:eastAsia="Courier New" w:hAnsi="Courier New"/>
-          <w:sz w:val="20"/>
-          <w:lang w:val="en-US"/>
-        </w:rPr>
-        <w:t>python easyrob.py</w:t>
-      </w:r>
     </w:p>
     <w:sectPr>
       <w:pgSz w:w="11906" w:h="16838"/>
@@ -11719,7 +10520,6 @@
   <w:style w:type="character" w:default="1" w:styleId="DefaultParagraphFont">
     <w:name w:val="Default Paragraph Font"/>
     <w:uiPriority w:val="1"/>
-    <w:semiHidden/>
     <w:unhideWhenUsed/>
   </w:style>
   <w:style w:type="table" w:default="1" w:styleId="TableNormal">

</xml_diff>